<commit_message>
docs: atualiza MER/DER com historico_alimentos, lista_compras e views
</commit_message>
<xml_diff>
--- a/docs/ReFood_MER_DER.docx
+++ b/docs/ReFood_MER_DER.docx
@@ -261,6 +261,36 @@
           <w:szCs w:val="20"/>
         </w:rPr>
         <w:t xml:space="preserve">Para resolver essas questões, as categorias foram extraídas para uma entidade própria, atendendo à Segunda Forma Normal (2FN). Com isso, o dado passa a existir em um único local, e o próprio SGBD garante, por meio de chave estrangeira, que nenhum alimento referencie uma categoria inexistente — princípio conhecido como integridade referencial.</w:t>
+      </w:r>
+    </w:p>
+    <w:p>
+      <w:pPr>
+        <w:spacing w:after="140" w:line="300"/>
+        <w:jc w:val="both"/>
+      </w:pPr>
+      <w:r>
+        <w:rPr>
+          <w:rFonts w:ascii="Arial" w:cs="Arial" w:eastAsia="Arial" w:hAnsi="Arial"/>
+          <w:color w:val="1A2E22"/>
+          <w:sz w:val="20"/>
+          <w:szCs w:val="20"/>
+        </w:rPr>
+        <w:t xml:space="preserve">Na prática, o modelo atinge a Terceira Forma Normal (3FN): além de não haver dependência parcial (toda tabela tem chave primária simples), também não há dependência transitiva — nenhum atributo não-chave de ALIMENTOS depende de outro atributo não-chave, já que os dados da categoria (nome, ícone) existem apenas em CATEGORIAS, nunca duplicados em ALIMENTOS.</w:t>
+      </w:r>
+    </w:p>
+    <w:p>
+      <w:pPr>
+        <w:spacing w:after="140" w:line="300"/>
+        <w:jc w:val="both"/>
+      </w:pPr>
+      <w:r>
+        <w:rPr>
+          <w:rFonts w:ascii="Arial" w:cs="Arial" w:eastAsia="Arial" w:hAnsi="Arial"/>
+          <w:color w:val="1A2E22"/>
+          <w:sz w:val="20"/>
+          <w:szCs w:val="20"/>
+        </w:rPr>
+        <w:t xml:space="preserve">As duas tabelas adicionadas na Sprint 2 (HISTÓRICO_ALIMENTOS e LISTA_COMPRAS, seções 3.3 e 3.4) seguem raciocínios distintos. HISTÓRICO_ALIMENTOS quebra a normalização de propósito: grava uma cópia de categoria_nome, quantidade, unidade etc. no momento da saída do alimento, porque o registro original em ALIMENTOS é excluído na mesma transação — sem essa cópia, o histórico perderia a informação assim que o item fosse consumido ou descartado. Essa desnormalização é deliberada e está documentada via COMMENT ON COLUMN no próprio banco (seção 6, DDL). Já LISTA_COMPRAS não desnormaliza nada: é uma entidade independente, sem chave estrangeira com as demais (seção 3.7), porque um item da lista pode nem existir ainda no estoque.</w:t>
       </w:r>
     </w:p>
     <w:p>
@@ -1986,7 +2016,2187 @@
           <w:sz w:val="22"/>
           <w:szCs w:val="22"/>
         </w:rPr>
-        <w:t xml:space="preserve">3.3  Relacionamento: CLASSIFICA</w:t>
+        <w:t xml:space="preserve">3.3  Entidade: HISTORICO_ALIMENTOS</w:t>
+      </w:r>
+    </w:p>
+    <w:p>
+      <w:pPr>
+        <w:spacing w:after="140" w:line="300"/>
+        <w:jc w:val="both"/>
+      </w:pPr>
+      <w:r>
+        <w:rPr>
+          <w:rFonts w:ascii="Arial" w:cs="Arial" w:eastAsia="Arial" w:hAnsi="Arial"/>
+          <w:color w:val="1A2E22"/>
+          <w:sz w:val="20"/>
+          <w:szCs w:val="20"/>
+        </w:rPr>
+        <w:t xml:space="preserve">Registra, de forma append-only (só recebe INSERT), cada alimento no momento em que sai da despensa — consumido ou descartado. É a base do relatório de desperdício (US-12) e do histórico de consumo (US-13).</w:t>
+      </w:r>
+    </w:p>
+    <w:tbl>
+      <w:tblPr>
+        <w:tblW w:type="dxa" w:w="8800"/>
+        <w:tblBorders>
+          <w:top w:val="single" w:color="auto" w:sz="4"/>
+          <w:left w:val="single" w:color="auto" w:sz="4"/>
+          <w:bottom w:val="single" w:color="auto" w:sz="4"/>
+          <w:right w:val="single" w:color="auto" w:sz="4"/>
+          <w:insideH w:val="single" w:color="auto" w:sz="4"/>
+          <w:insideV w:val="single" w:color="auto" w:sz="4"/>
+        </w:tblBorders>
+      </w:tblPr>
+      <w:tblGrid>
+        <w:gridCol w:w="1900"/>
+        <w:gridCol w:w="1900"/>
+        <w:gridCol w:w="5000"/>
+      </w:tblGrid>
+      <w:tr>
+        <w:trPr>
+          <w:tblHeader/>
+        </w:trPr>
+        <w:tc>
+          <w:tcPr>
+            <w:tcW w:type="dxa" w:w="1900"/>
+            <w:tcBorders>
+              <w:top w:val="single" w:color="2D6A4F" w:sz="4"/>
+              <w:left w:val="single" w:color="2D6A4F" w:sz="4"/>
+              <w:bottom w:val="single" w:color="2D6A4F" w:sz="4"/>
+              <w:right w:val="single" w:color="2D6A4F" w:sz="4"/>
+            </w:tcBorders>
+            <w:shd w:fill="2D6A4F" w:val="clear"/>
+            <w:tcMar>
+              <w:top w:type="dxa" w:w="80"/>
+              <w:left w:type="dxa" w:w="120"/>
+              <w:bottom w:type="dxa" w:w="80"/>
+              <w:right w:type="dxa" w:w="120"/>
+            </w:tcMar>
+            <w:vAlign w:val="center"/>
+          </w:tcPr>
+          <w:p>
+            <w:pPr>
+              <w:jc w:val="left"/>
+            </w:pPr>
+            <w:r>
+              <w:rPr>
+                <w:rFonts w:ascii="Arial" w:cs="Arial" w:eastAsia="Arial" w:hAnsi="Arial"/>
+                <w:b/>
+                <w:bCs/>
+                <w:color w:val="FFFFFF"/>
+                <w:sz w:val="18"/>
+                <w:szCs w:val="18"/>
+              </w:rPr>
+              <w:t xml:space="preserve">Atributo</w:t>
+            </w:r>
+          </w:p>
+        </w:tc>
+        <w:tc>
+          <w:tcPr>
+            <w:tcW w:type="dxa" w:w="1900"/>
+            <w:tcBorders>
+              <w:top w:val="single" w:color="2D6A4F" w:sz="4"/>
+              <w:left w:val="single" w:color="2D6A4F" w:sz="4"/>
+              <w:bottom w:val="single" w:color="2D6A4F" w:sz="4"/>
+              <w:right w:val="single" w:color="2D6A4F" w:sz="4"/>
+            </w:tcBorders>
+            <w:shd w:fill="2D6A4F" w:val="clear"/>
+            <w:tcMar>
+              <w:top w:type="dxa" w:w="80"/>
+              <w:left w:type="dxa" w:w="120"/>
+              <w:bottom w:type="dxa" w:w="80"/>
+              <w:right w:type="dxa" w:w="120"/>
+            </w:tcMar>
+            <w:vAlign w:val="center"/>
+          </w:tcPr>
+          <w:p>
+            <w:pPr>
+              <w:jc w:val="left"/>
+            </w:pPr>
+            <w:r>
+              <w:rPr>
+                <w:rFonts w:ascii="Arial" w:cs="Arial" w:eastAsia="Arial" w:hAnsi="Arial"/>
+                <w:b/>
+                <w:bCs/>
+                <w:color w:val="FFFFFF"/>
+                <w:sz w:val="18"/>
+                <w:szCs w:val="18"/>
+              </w:rPr>
+              <w:t xml:space="preserve">Tipo</w:t>
+            </w:r>
+          </w:p>
+        </w:tc>
+        <w:tc>
+          <w:tcPr>
+            <w:tcW w:type="dxa" w:w="5000"/>
+            <w:tcBorders>
+              <w:top w:val="single" w:color="2D6A4F" w:sz="4"/>
+              <w:left w:val="single" w:color="2D6A4F" w:sz="4"/>
+              <w:bottom w:val="single" w:color="2D6A4F" w:sz="4"/>
+              <w:right w:val="single" w:color="2D6A4F" w:sz="4"/>
+            </w:tcBorders>
+            <w:shd w:fill="2D6A4F" w:val="clear"/>
+            <w:tcMar>
+              <w:top w:type="dxa" w:w="80"/>
+              <w:left w:type="dxa" w:w="120"/>
+              <w:bottom w:type="dxa" w:w="80"/>
+              <w:right w:type="dxa" w:w="120"/>
+            </w:tcMar>
+            <w:vAlign w:val="center"/>
+          </w:tcPr>
+          <w:p>
+            <w:pPr>
+              <w:jc w:val="left"/>
+            </w:pPr>
+            <w:r>
+              <w:rPr>
+                <w:rFonts w:ascii="Arial" w:cs="Arial" w:eastAsia="Arial" w:hAnsi="Arial"/>
+                <w:b/>
+                <w:bCs/>
+                <w:color w:val="FFFFFF"/>
+                <w:sz w:val="18"/>
+                <w:szCs w:val="18"/>
+              </w:rPr>
+              <w:t xml:space="preserve">Descrição</w:t>
+            </w:r>
+          </w:p>
+        </w:tc>
+      </w:tr>
+      <w:tr>
+        <w:tc>
+          <w:tcPr>
+            <w:tcW w:type="dxa" w:w="1900"/>
+            <w:tcBorders>
+              <w:top w:val="single" w:color="C8E6D4" w:sz="4"/>
+              <w:left w:val="single" w:color="C8E6D4" w:sz="4"/>
+              <w:bottom w:val="single" w:color="C8E6D4" w:sz="4"/>
+              <w:right w:val="single" w:color="C8E6D4" w:sz="4"/>
+            </w:tcBorders>
+            <w:shd w:fill="FFFFFF" w:val="clear"/>
+            <w:tcMar>
+              <w:top w:type="dxa" w:w="80"/>
+              <w:left w:type="dxa" w:w="120"/>
+              <w:bottom w:type="dxa" w:w="80"/>
+              <w:right w:type="dxa" w:w="120"/>
+            </w:tcMar>
+            <w:vAlign w:val="center"/>
+          </w:tcPr>
+          <w:p>
+            <w:r>
+              <w:rPr>
+                <w:rFonts w:ascii="Consolas" w:cs="Consolas" w:eastAsia="Consolas" w:hAnsi="Consolas"/>
+                <w:b/>
+                <w:bCs/>
+                <w:color w:val="2D6A4F"/>
+                <w:sz w:val="17"/>
+                <w:szCs w:val="17"/>
+              </w:rPr>
+              <w:t xml:space="preserve">id</w:t>
+            </w:r>
+          </w:p>
+        </w:tc>
+        <w:tc>
+          <w:tcPr>
+            <w:tcW w:type="dxa" w:w="1900"/>
+            <w:tcBorders>
+              <w:top w:val="single" w:color="C8E6D4" w:sz="4"/>
+              <w:left w:val="single" w:color="C8E6D4" w:sz="4"/>
+              <w:bottom w:val="single" w:color="C8E6D4" w:sz="4"/>
+              <w:right w:val="single" w:color="C8E6D4" w:sz="4"/>
+            </w:tcBorders>
+            <w:shd w:fill="FFFFFF" w:val="clear"/>
+            <w:tcMar>
+              <w:top w:type="dxa" w:w="80"/>
+              <w:left w:type="dxa" w:w="120"/>
+              <w:bottom w:type="dxa" w:w="80"/>
+              <w:right w:type="dxa" w:w="120"/>
+            </w:tcMar>
+            <w:vAlign w:val="center"/>
+          </w:tcPr>
+          <w:p>
+            <w:r>
+              <w:rPr>
+                <w:rFonts w:ascii="Consolas" w:cs="Consolas" w:eastAsia="Consolas" w:hAnsi="Consolas"/>
+                <w:b w:val="false"/>
+                <w:bCs w:val="false"/>
+                <w:color w:val="4A6358"/>
+                <w:sz w:val="17"/>
+                <w:szCs w:val="17"/>
+              </w:rPr>
+              <w:t xml:space="preserve">SERIAL</w:t>
+            </w:r>
+          </w:p>
+        </w:tc>
+        <w:tc>
+          <w:tcPr>
+            <w:tcW w:type="dxa" w:w="5000"/>
+            <w:tcBorders>
+              <w:top w:val="single" w:color="C8E6D4" w:sz="4"/>
+              <w:left w:val="single" w:color="C8E6D4" w:sz="4"/>
+              <w:bottom w:val="single" w:color="C8E6D4" w:sz="4"/>
+              <w:right w:val="single" w:color="C8E6D4" w:sz="4"/>
+            </w:tcBorders>
+            <w:shd w:fill="FFFFFF" w:val="clear"/>
+            <w:tcMar>
+              <w:top w:type="dxa" w:w="80"/>
+              <w:left w:type="dxa" w:w="120"/>
+              <w:bottom w:type="dxa" w:w="80"/>
+              <w:right w:type="dxa" w:w="120"/>
+            </w:tcMar>
+            <w:vAlign w:val="center"/>
+          </w:tcPr>
+          <w:p>
+            <w:r>
+              <w:rPr>
+                <w:rFonts w:ascii="Arial" w:cs="Arial" w:eastAsia="Arial" w:hAnsi="Arial"/>
+                <w:b w:val="false"/>
+                <w:bCs w:val="false"/>
+                <w:color w:val="1A2E22"/>
+                <w:sz w:val="17"/>
+                <w:szCs w:val="17"/>
+              </w:rPr>
+              <w:t xml:space="preserve">Identificador único do registro de histórico (chave primária)</w:t>
+            </w:r>
+          </w:p>
+        </w:tc>
+      </w:tr>
+      <w:tr>
+        <w:tc>
+          <w:tcPr>
+            <w:tcW w:type="dxa" w:w="1900"/>
+            <w:tcBorders>
+              <w:top w:val="single" w:color="C8E6D4" w:sz="4"/>
+              <w:left w:val="single" w:color="C8E6D4" w:sz="4"/>
+              <w:bottom w:val="single" w:color="C8E6D4" w:sz="4"/>
+              <w:right w:val="single" w:color="C8E6D4" w:sz="4"/>
+            </w:tcBorders>
+            <w:shd w:fill="F4FAF6" w:val="clear"/>
+            <w:tcMar>
+              <w:top w:type="dxa" w:w="80"/>
+              <w:left w:type="dxa" w:w="120"/>
+              <w:bottom w:type="dxa" w:w="80"/>
+              <w:right w:type="dxa" w:w="120"/>
+            </w:tcMar>
+            <w:vAlign w:val="center"/>
+          </w:tcPr>
+          <w:p>
+            <w:r>
+              <w:rPr>
+                <w:rFonts w:ascii="Consolas" w:cs="Consolas" w:eastAsia="Consolas" w:hAnsi="Consolas"/>
+                <w:b/>
+                <w:bCs/>
+                <w:color w:val="2D6A4F"/>
+                <w:sz w:val="17"/>
+                <w:szCs w:val="17"/>
+              </w:rPr>
+              <w:t xml:space="preserve">alimento_id</w:t>
+            </w:r>
+          </w:p>
+        </w:tc>
+        <w:tc>
+          <w:tcPr>
+            <w:tcW w:type="dxa" w:w="1900"/>
+            <w:tcBorders>
+              <w:top w:val="single" w:color="C8E6D4" w:sz="4"/>
+              <w:left w:val="single" w:color="C8E6D4" w:sz="4"/>
+              <w:bottom w:val="single" w:color="C8E6D4" w:sz="4"/>
+              <w:right w:val="single" w:color="C8E6D4" w:sz="4"/>
+            </w:tcBorders>
+            <w:shd w:fill="F4FAF6" w:val="clear"/>
+            <w:tcMar>
+              <w:top w:type="dxa" w:w="80"/>
+              <w:left w:type="dxa" w:w="120"/>
+              <w:bottom w:type="dxa" w:w="80"/>
+              <w:right w:type="dxa" w:w="120"/>
+            </w:tcMar>
+            <w:vAlign w:val="center"/>
+          </w:tcPr>
+          <w:p>
+            <w:r>
+              <w:rPr>
+                <w:rFonts w:ascii="Consolas" w:cs="Consolas" w:eastAsia="Consolas" w:hAnsi="Consolas"/>
+                <w:b w:val="false"/>
+                <w:bCs w:val="false"/>
+                <w:color w:val="4A6358"/>
+                <w:sz w:val="17"/>
+                <w:szCs w:val="17"/>
+              </w:rPr>
+              <w:t xml:space="preserve">INTEGER</w:t>
+            </w:r>
+          </w:p>
+        </w:tc>
+        <w:tc>
+          <w:tcPr>
+            <w:tcW w:type="dxa" w:w="5000"/>
+            <w:tcBorders>
+              <w:top w:val="single" w:color="C8E6D4" w:sz="4"/>
+              <w:left w:val="single" w:color="C8E6D4" w:sz="4"/>
+              <w:bottom w:val="single" w:color="C8E6D4" w:sz="4"/>
+              <w:right w:val="single" w:color="C8E6D4" w:sz="4"/>
+            </w:tcBorders>
+            <w:shd w:fill="F4FAF6" w:val="clear"/>
+            <w:tcMar>
+              <w:top w:type="dxa" w:w="80"/>
+              <w:left w:type="dxa" w:w="120"/>
+              <w:bottom w:type="dxa" w:w="80"/>
+              <w:right w:type="dxa" w:w="120"/>
+            </w:tcMar>
+            <w:vAlign w:val="center"/>
+          </w:tcPr>
+          <w:p>
+            <w:r>
+              <w:rPr>
+                <w:rFonts w:ascii="Arial" w:cs="Arial" w:eastAsia="Arial" w:hAnsi="Arial"/>
+                <w:b w:val="false"/>
+                <w:bCs w:val="false"/>
+                <w:color w:val="1A2E22"/>
+                <w:sz w:val="17"/>
+                <w:szCs w:val="17"/>
+              </w:rPr>
+              <w:t xml:space="preserve">Id do alimento original em ALIMENTOS — não é chave estrangeira: o registro de origem é excluído no mesmo instante em que o histórico é gravado (ver seção 3.6)</w:t>
+            </w:r>
+          </w:p>
+        </w:tc>
+      </w:tr>
+      <w:tr>
+        <w:tc>
+          <w:tcPr>
+            <w:tcW w:type="dxa" w:w="1900"/>
+            <w:tcBorders>
+              <w:top w:val="single" w:color="C8E6D4" w:sz="4"/>
+              <w:left w:val="single" w:color="C8E6D4" w:sz="4"/>
+              <w:bottom w:val="single" w:color="C8E6D4" w:sz="4"/>
+              <w:right w:val="single" w:color="C8E6D4" w:sz="4"/>
+            </w:tcBorders>
+            <w:shd w:fill="FFFFFF" w:val="clear"/>
+            <w:tcMar>
+              <w:top w:type="dxa" w:w="80"/>
+              <w:left w:type="dxa" w:w="120"/>
+              <w:bottom w:type="dxa" w:w="80"/>
+              <w:right w:type="dxa" w:w="120"/>
+            </w:tcMar>
+            <w:vAlign w:val="center"/>
+          </w:tcPr>
+          <w:p>
+            <w:r>
+              <w:rPr>
+                <w:rFonts w:ascii="Consolas" w:cs="Consolas" w:eastAsia="Consolas" w:hAnsi="Consolas"/>
+                <w:b/>
+                <w:bCs/>
+                <w:color w:val="2D6A4F"/>
+                <w:sz w:val="17"/>
+                <w:szCs w:val="17"/>
+              </w:rPr>
+              <w:t xml:space="preserve">nome</w:t>
+            </w:r>
+          </w:p>
+        </w:tc>
+        <w:tc>
+          <w:tcPr>
+            <w:tcW w:type="dxa" w:w="1900"/>
+            <w:tcBorders>
+              <w:top w:val="single" w:color="C8E6D4" w:sz="4"/>
+              <w:left w:val="single" w:color="C8E6D4" w:sz="4"/>
+              <w:bottom w:val="single" w:color="C8E6D4" w:sz="4"/>
+              <w:right w:val="single" w:color="C8E6D4" w:sz="4"/>
+            </w:tcBorders>
+            <w:shd w:fill="FFFFFF" w:val="clear"/>
+            <w:tcMar>
+              <w:top w:type="dxa" w:w="80"/>
+              <w:left w:type="dxa" w:w="120"/>
+              <w:bottom w:type="dxa" w:w="80"/>
+              <w:right w:type="dxa" w:w="120"/>
+            </w:tcMar>
+            <w:vAlign w:val="center"/>
+          </w:tcPr>
+          <w:p>
+            <w:r>
+              <w:rPr>
+                <w:rFonts w:ascii="Consolas" w:cs="Consolas" w:eastAsia="Consolas" w:hAnsi="Consolas"/>
+                <w:b w:val="false"/>
+                <w:bCs w:val="false"/>
+                <w:color w:val="4A6358"/>
+                <w:sz w:val="17"/>
+                <w:szCs w:val="17"/>
+              </w:rPr>
+              <w:t xml:space="preserve">VARCHAR(100)</w:t>
+            </w:r>
+          </w:p>
+        </w:tc>
+        <w:tc>
+          <w:tcPr>
+            <w:tcW w:type="dxa" w:w="5000"/>
+            <w:tcBorders>
+              <w:top w:val="single" w:color="C8E6D4" w:sz="4"/>
+              <w:left w:val="single" w:color="C8E6D4" w:sz="4"/>
+              <w:bottom w:val="single" w:color="C8E6D4" w:sz="4"/>
+              <w:right w:val="single" w:color="C8E6D4" w:sz="4"/>
+            </w:tcBorders>
+            <w:shd w:fill="FFFFFF" w:val="clear"/>
+            <w:tcMar>
+              <w:top w:type="dxa" w:w="80"/>
+              <w:left w:type="dxa" w:w="120"/>
+              <w:bottom w:type="dxa" w:w="80"/>
+              <w:right w:type="dxa" w:w="120"/>
+            </w:tcMar>
+            <w:vAlign w:val="center"/>
+          </w:tcPr>
+          <w:p>
+            <w:r>
+              <w:rPr>
+                <w:rFonts w:ascii="Arial" w:cs="Arial" w:eastAsia="Arial" w:hAnsi="Arial"/>
+                <w:b w:val="false"/>
+                <w:bCs w:val="false"/>
+                <w:color w:val="1A2E22"/>
+                <w:sz w:val="17"/>
+                <w:szCs w:val="17"/>
+              </w:rPr>
+              <w:t xml:space="preserve">Nome do alimento no momento da saída</w:t>
+            </w:r>
+          </w:p>
+        </w:tc>
+      </w:tr>
+      <w:tr>
+        <w:tc>
+          <w:tcPr>
+            <w:tcW w:type="dxa" w:w="1900"/>
+            <w:tcBorders>
+              <w:top w:val="single" w:color="C8E6D4" w:sz="4"/>
+              <w:left w:val="single" w:color="C8E6D4" w:sz="4"/>
+              <w:bottom w:val="single" w:color="C8E6D4" w:sz="4"/>
+              <w:right w:val="single" w:color="C8E6D4" w:sz="4"/>
+            </w:tcBorders>
+            <w:shd w:fill="F4FAF6" w:val="clear"/>
+            <w:tcMar>
+              <w:top w:type="dxa" w:w="80"/>
+              <w:left w:type="dxa" w:w="120"/>
+              <w:bottom w:type="dxa" w:w="80"/>
+              <w:right w:type="dxa" w:w="120"/>
+            </w:tcMar>
+            <w:vAlign w:val="center"/>
+          </w:tcPr>
+          <w:p>
+            <w:r>
+              <w:rPr>
+                <w:rFonts w:ascii="Consolas" w:cs="Consolas" w:eastAsia="Consolas" w:hAnsi="Consolas"/>
+                <w:b/>
+                <w:bCs/>
+                <w:color w:val="2D6A4F"/>
+                <w:sz w:val="17"/>
+                <w:szCs w:val="17"/>
+              </w:rPr>
+              <w:t xml:space="preserve">categoria_id</w:t>
+            </w:r>
+          </w:p>
+        </w:tc>
+        <w:tc>
+          <w:tcPr>
+            <w:tcW w:type="dxa" w:w="1900"/>
+            <w:tcBorders>
+              <w:top w:val="single" w:color="C8E6D4" w:sz="4"/>
+              <w:left w:val="single" w:color="C8E6D4" w:sz="4"/>
+              <w:bottom w:val="single" w:color="C8E6D4" w:sz="4"/>
+              <w:right w:val="single" w:color="C8E6D4" w:sz="4"/>
+            </w:tcBorders>
+            <w:shd w:fill="F4FAF6" w:val="clear"/>
+            <w:tcMar>
+              <w:top w:type="dxa" w:w="80"/>
+              <w:left w:type="dxa" w:w="120"/>
+              <w:bottom w:type="dxa" w:w="80"/>
+              <w:right w:type="dxa" w:w="120"/>
+            </w:tcMar>
+            <w:vAlign w:val="center"/>
+          </w:tcPr>
+          <w:p>
+            <w:r>
+              <w:rPr>
+                <w:rFonts w:ascii="Consolas" w:cs="Consolas" w:eastAsia="Consolas" w:hAnsi="Consolas"/>
+                <w:b w:val="false"/>
+                <w:bCs w:val="false"/>
+                <w:color w:val="4A6358"/>
+                <w:sz w:val="17"/>
+                <w:szCs w:val="17"/>
+              </w:rPr>
+              <w:t xml:space="preserve">INTEGER</w:t>
+            </w:r>
+          </w:p>
+        </w:tc>
+        <w:tc>
+          <w:tcPr>
+            <w:tcW w:type="dxa" w:w="5000"/>
+            <w:tcBorders>
+              <w:top w:val="single" w:color="C8E6D4" w:sz="4"/>
+              <w:left w:val="single" w:color="C8E6D4" w:sz="4"/>
+              <w:bottom w:val="single" w:color="C8E6D4" w:sz="4"/>
+              <w:right w:val="single" w:color="C8E6D4" w:sz="4"/>
+            </w:tcBorders>
+            <w:shd w:fill="F4FAF6" w:val="clear"/>
+            <w:tcMar>
+              <w:top w:type="dxa" w:w="80"/>
+              <w:left w:type="dxa" w:w="120"/>
+              <w:bottom w:type="dxa" w:w="80"/>
+              <w:right w:type="dxa" w:w="120"/>
+            </w:tcMar>
+            <w:vAlign w:val="center"/>
+          </w:tcPr>
+          <w:p>
+            <w:r>
+              <w:rPr>
+                <w:rFonts w:ascii="Arial" w:cs="Arial" w:eastAsia="Arial" w:hAnsi="Arial"/>
+                <w:b w:val="false"/>
+                <w:bCs w:val="false"/>
+                <w:color w:val="1A2E22"/>
+                <w:sz w:val="17"/>
+                <w:szCs w:val="17"/>
+              </w:rPr>
+              <w:t xml:space="preserve">Referência à categoria (chave estrangeira, aceita NULL — ON DELETE SET NULL)</w:t>
+            </w:r>
+          </w:p>
+        </w:tc>
+      </w:tr>
+      <w:tr>
+        <w:tc>
+          <w:tcPr>
+            <w:tcW w:type="dxa" w:w="1900"/>
+            <w:tcBorders>
+              <w:top w:val="single" w:color="C8E6D4" w:sz="4"/>
+              <w:left w:val="single" w:color="C8E6D4" w:sz="4"/>
+              <w:bottom w:val="single" w:color="C8E6D4" w:sz="4"/>
+              <w:right w:val="single" w:color="C8E6D4" w:sz="4"/>
+            </w:tcBorders>
+            <w:shd w:fill="FFFFFF" w:val="clear"/>
+            <w:tcMar>
+              <w:top w:type="dxa" w:w="80"/>
+              <w:left w:type="dxa" w:w="120"/>
+              <w:bottom w:type="dxa" w:w="80"/>
+              <w:right w:type="dxa" w:w="120"/>
+            </w:tcMar>
+            <w:vAlign w:val="center"/>
+          </w:tcPr>
+          <w:p>
+            <w:r>
+              <w:rPr>
+                <w:rFonts w:ascii="Consolas" w:cs="Consolas" w:eastAsia="Consolas" w:hAnsi="Consolas"/>
+                <w:b/>
+                <w:bCs/>
+                <w:color w:val="2D6A4F"/>
+                <w:sz w:val="17"/>
+                <w:szCs w:val="17"/>
+              </w:rPr>
+              <w:t xml:space="preserve">categoria_nome</w:t>
+            </w:r>
+          </w:p>
+        </w:tc>
+        <w:tc>
+          <w:tcPr>
+            <w:tcW w:type="dxa" w:w="1900"/>
+            <w:tcBorders>
+              <w:top w:val="single" w:color="C8E6D4" w:sz="4"/>
+              <w:left w:val="single" w:color="C8E6D4" w:sz="4"/>
+              <w:bottom w:val="single" w:color="C8E6D4" w:sz="4"/>
+              <w:right w:val="single" w:color="C8E6D4" w:sz="4"/>
+            </w:tcBorders>
+            <w:shd w:fill="FFFFFF" w:val="clear"/>
+            <w:tcMar>
+              <w:top w:type="dxa" w:w="80"/>
+              <w:left w:type="dxa" w:w="120"/>
+              <w:bottom w:type="dxa" w:w="80"/>
+              <w:right w:type="dxa" w:w="120"/>
+            </w:tcMar>
+            <w:vAlign w:val="center"/>
+          </w:tcPr>
+          <w:p>
+            <w:r>
+              <w:rPr>
+                <w:rFonts w:ascii="Consolas" w:cs="Consolas" w:eastAsia="Consolas" w:hAnsi="Consolas"/>
+                <w:b w:val="false"/>
+                <w:bCs w:val="false"/>
+                <w:color w:val="4A6358"/>
+                <w:sz w:val="17"/>
+                <w:szCs w:val="17"/>
+              </w:rPr>
+              <w:t xml:space="preserve">VARCHAR(50)</w:t>
+            </w:r>
+          </w:p>
+        </w:tc>
+        <w:tc>
+          <w:tcPr>
+            <w:tcW w:type="dxa" w:w="5000"/>
+            <w:tcBorders>
+              <w:top w:val="single" w:color="C8E6D4" w:sz="4"/>
+              <w:left w:val="single" w:color="C8E6D4" w:sz="4"/>
+              <w:bottom w:val="single" w:color="C8E6D4" w:sz="4"/>
+              <w:right w:val="single" w:color="C8E6D4" w:sz="4"/>
+            </w:tcBorders>
+            <w:shd w:fill="FFFFFF" w:val="clear"/>
+            <w:tcMar>
+              <w:top w:type="dxa" w:w="80"/>
+              <w:left w:type="dxa" w:w="120"/>
+              <w:bottom w:type="dxa" w:w="80"/>
+              <w:right w:type="dxa" w:w="120"/>
+            </w:tcMar>
+            <w:vAlign w:val="center"/>
+          </w:tcPr>
+          <w:p>
+            <w:r>
+              <w:rPr>
+                <w:rFonts w:ascii="Arial" w:cs="Arial" w:eastAsia="Arial" w:hAnsi="Arial"/>
+                <w:b w:val="false"/>
+                <w:bCs w:val="false"/>
+                <w:color w:val="1A2E22"/>
+                <w:sz w:val="17"/>
+                <w:szCs w:val="17"/>
+              </w:rPr>
+              <w:t xml:space="preserve">Nome da categoria copiado à parte, para sobreviver se a categoria for excluída ou renomeada depois</w:t>
+            </w:r>
+          </w:p>
+        </w:tc>
+      </w:tr>
+      <w:tr>
+        <w:tc>
+          <w:tcPr>
+            <w:tcW w:type="dxa" w:w="1900"/>
+            <w:tcBorders>
+              <w:top w:val="single" w:color="C8E6D4" w:sz="4"/>
+              <w:left w:val="single" w:color="C8E6D4" w:sz="4"/>
+              <w:bottom w:val="single" w:color="C8E6D4" w:sz="4"/>
+              <w:right w:val="single" w:color="C8E6D4" w:sz="4"/>
+            </w:tcBorders>
+            <w:shd w:fill="F4FAF6" w:val="clear"/>
+            <w:tcMar>
+              <w:top w:type="dxa" w:w="80"/>
+              <w:left w:type="dxa" w:w="120"/>
+              <w:bottom w:type="dxa" w:w="80"/>
+              <w:right w:type="dxa" w:w="120"/>
+            </w:tcMar>
+            <w:vAlign w:val="center"/>
+          </w:tcPr>
+          <w:p>
+            <w:r>
+              <w:rPr>
+                <w:rFonts w:ascii="Consolas" w:cs="Consolas" w:eastAsia="Consolas" w:hAnsi="Consolas"/>
+                <w:b/>
+                <w:bCs/>
+                <w:color w:val="2D6A4F"/>
+                <w:sz w:val="17"/>
+                <w:szCs w:val="17"/>
+              </w:rPr>
+              <w:t xml:space="preserve">quantidade</w:t>
+            </w:r>
+          </w:p>
+        </w:tc>
+        <w:tc>
+          <w:tcPr>
+            <w:tcW w:type="dxa" w:w="1900"/>
+            <w:tcBorders>
+              <w:top w:val="single" w:color="C8E6D4" w:sz="4"/>
+              <w:left w:val="single" w:color="C8E6D4" w:sz="4"/>
+              <w:bottom w:val="single" w:color="C8E6D4" w:sz="4"/>
+              <w:right w:val="single" w:color="C8E6D4" w:sz="4"/>
+            </w:tcBorders>
+            <w:shd w:fill="F4FAF6" w:val="clear"/>
+            <w:tcMar>
+              <w:top w:type="dxa" w:w="80"/>
+              <w:left w:type="dxa" w:w="120"/>
+              <w:bottom w:type="dxa" w:w="80"/>
+              <w:right w:type="dxa" w:w="120"/>
+            </w:tcMar>
+            <w:vAlign w:val="center"/>
+          </w:tcPr>
+          <w:p>
+            <w:r>
+              <w:rPr>
+                <w:rFonts w:ascii="Consolas" w:cs="Consolas" w:eastAsia="Consolas" w:hAnsi="Consolas"/>
+                <w:b w:val="false"/>
+                <w:bCs w:val="false"/>
+                <w:color w:val="4A6358"/>
+                <w:sz w:val="17"/>
+                <w:szCs w:val="17"/>
+              </w:rPr>
+              <w:t xml:space="preserve">DECIMAL(10,2)</w:t>
+            </w:r>
+          </w:p>
+        </w:tc>
+        <w:tc>
+          <w:tcPr>
+            <w:tcW w:type="dxa" w:w="5000"/>
+            <w:tcBorders>
+              <w:top w:val="single" w:color="C8E6D4" w:sz="4"/>
+              <w:left w:val="single" w:color="C8E6D4" w:sz="4"/>
+              <w:bottom w:val="single" w:color="C8E6D4" w:sz="4"/>
+              <w:right w:val="single" w:color="C8E6D4" w:sz="4"/>
+            </w:tcBorders>
+            <w:shd w:fill="F4FAF6" w:val="clear"/>
+            <w:tcMar>
+              <w:top w:type="dxa" w:w="80"/>
+              <w:left w:type="dxa" w:w="120"/>
+              <w:bottom w:type="dxa" w:w="80"/>
+              <w:right w:type="dxa" w:w="120"/>
+            </w:tcMar>
+            <w:vAlign w:val="center"/>
+          </w:tcPr>
+          <w:p>
+            <w:r>
+              <w:rPr>
+                <w:rFonts w:ascii="Arial" w:cs="Arial" w:eastAsia="Arial" w:hAnsi="Arial"/>
+                <w:b w:val="false"/>
+                <w:bCs w:val="false"/>
+                <w:color w:val="1A2E22"/>
+                <w:sz w:val="17"/>
+                <w:szCs w:val="17"/>
+              </w:rPr>
+              <w:t xml:space="preserve">Quantidade que saiu da despensa</w:t>
+            </w:r>
+          </w:p>
+        </w:tc>
+      </w:tr>
+      <w:tr>
+        <w:tc>
+          <w:tcPr>
+            <w:tcW w:type="dxa" w:w="1900"/>
+            <w:tcBorders>
+              <w:top w:val="single" w:color="C8E6D4" w:sz="4"/>
+              <w:left w:val="single" w:color="C8E6D4" w:sz="4"/>
+              <w:bottom w:val="single" w:color="C8E6D4" w:sz="4"/>
+              <w:right w:val="single" w:color="C8E6D4" w:sz="4"/>
+            </w:tcBorders>
+            <w:shd w:fill="FFFFFF" w:val="clear"/>
+            <w:tcMar>
+              <w:top w:type="dxa" w:w="80"/>
+              <w:left w:type="dxa" w:w="120"/>
+              <w:bottom w:type="dxa" w:w="80"/>
+              <w:right w:type="dxa" w:w="120"/>
+            </w:tcMar>
+            <w:vAlign w:val="center"/>
+          </w:tcPr>
+          <w:p>
+            <w:r>
+              <w:rPr>
+                <w:rFonts w:ascii="Consolas" w:cs="Consolas" w:eastAsia="Consolas" w:hAnsi="Consolas"/>
+                <w:b/>
+                <w:bCs/>
+                <w:color w:val="2D6A4F"/>
+                <w:sz w:val="17"/>
+                <w:szCs w:val="17"/>
+              </w:rPr>
+              <w:t xml:space="preserve">unidade</w:t>
+            </w:r>
+          </w:p>
+        </w:tc>
+        <w:tc>
+          <w:tcPr>
+            <w:tcW w:type="dxa" w:w="1900"/>
+            <w:tcBorders>
+              <w:top w:val="single" w:color="C8E6D4" w:sz="4"/>
+              <w:left w:val="single" w:color="C8E6D4" w:sz="4"/>
+              <w:bottom w:val="single" w:color="C8E6D4" w:sz="4"/>
+              <w:right w:val="single" w:color="C8E6D4" w:sz="4"/>
+            </w:tcBorders>
+            <w:shd w:fill="FFFFFF" w:val="clear"/>
+            <w:tcMar>
+              <w:top w:type="dxa" w:w="80"/>
+              <w:left w:type="dxa" w:w="120"/>
+              <w:bottom w:type="dxa" w:w="80"/>
+              <w:right w:type="dxa" w:w="120"/>
+            </w:tcMar>
+            <w:vAlign w:val="center"/>
+          </w:tcPr>
+          <w:p>
+            <w:r>
+              <w:rPr>
+                <w:rFonts w:ascii="Consolas" w:cs="Consolas" w:eastAsia="Consolas" w:hAnsi="Consolas"/>
+                <w:b w:val="false"/>
+                <w:bCs w:val="false"/>
+                <w:color w:val="4A6358"/>
+                <w:sz w:val="17"/>
+                <w:szCs w:val="17"/>
+              </w:rPr>
+              <w:t xml:space="preserve">VARCHAR(20)</w:t>
+            </w:r>
+          </w:p>
+        </w:tc>
+        <w:tc>
+          <w:tcPr>
+            <w:tcW w:type="dxa" w:w="5000"/>
+            <w:tcBorders>
+              <w:top w:val="single" w:color="C8E6D4" w:sz="4"/>
+              <w:left w:val="single" w:color="C8E6D4" w:sz="4"/>
+              <w:bottom w:val="single" w:color="C8E6D4" w:sz="4"/>
+              <w:right w:val="single" w:color="C8E6D4" w:sz="4"/>
+            </w:tcBorders>
+            <w:shd w:fill="FFFFFF" w:val="clear"/>
+            <w:tcMar>
+              <w:top w:type="dxa" w:w="80"/>
+              <w:left w:type="dxa" w:w="120"/>
+              <w:bottom w:type="dxa" w:w="80"/>
+              <w:right w:type="dxa" w:w="120"/>
+            </w:tcMar>
+            <w:vAlign w:val="center"/>
+          </w:tcPr>
+          <w:p>
+            <w:r>
+              <w:rPr>
+                <w:rFonts w:ascii="Arial" w:cs="Arial" w:eastAsia="Arial" w:hAnsi="Arial"/>
+                <w:b w:val="false"/>
+                <w:bCs w:val="false"/>
+                <w:color w:val="1A2E22"/>
+                <w:sz w:val="17"/>
+                <w:szCs w:val="17"/>
+              </w:rPr>
+              <w:t xml:space="preserve">Unidade de medida</w:t>
+            </w:r>
+          </w:p>
+        </w:tc>
+      </w:tr>
+      <w:tr>
+        <w:tc>
+          <w:tcPr>
+            <w:tcW w:type="dxa" w:w="1900"/>
+            <w:tcBorders>
+              <w:top w:val="single" w:color="C8E6D4" w:sz="4"/>
+              <w:left w:val="single" w:color="C8E6D4" w:sz="4"/>
+              <w:bottom w:val="single" w:color="C8E6D4" w:sz="4"/>
+              <w:right w:val="single" w:color="C8E6D4" w:sz="4"/>
+            </w:tcBorders>
+            <w:shd w:fill="F4FAF6" w:val="clear"/>
+            <w:tcMar>
+              <w:top w:type="dxa" w:w="80"/>
+              <w:left w:type="dxa" w:w="120"/>
+              <w:bottom w:type="dxa" w:w="80"/>
+              <w:right w:type="dxa" w:w="120"/>
+            </w:tcMar>
+            <w:vAlign w:val="center"/>
+          </w:tcPr>
+          <w:p>
+            <w:r>
+              <w:rPr>
+                <w:rFonts w:ascii="Consolas" w:cs="Consolas" w:eastAsia="Consolas" w:hAnsi="Consolas"/>
+                <w:b/>
+                <w:bCs/>
+                <w:color w:val="2D6A4F"/>
+                <w:sz w:val="17"/>
+                <w:szCs w:val="17"/>
+              </w:rPr>
+              <w:t xml:space="preserve">data_validade</w:t>
+            </w:r>
+          </w:p>
+        </w:tc>
+        <w:tc>
+          <w:tcPr>
+            <w:tcW w:type="dxa" w:w="1900"/>
+            <w:tcBorders>
+              <w:top w:val="single" w:color="C8E6D4" w:sz="4"/>
+              <w:left w:val="single" w:color="C8E6D4" w:sz="4"/>
+              <w:bottom w:val="single" w:color="C8E6D4" w:sz="4"/>
+              <w:right w:val="single" w:color="C8E6D4" w:sz="4"/>
+            </w:tcBorders>
+            <w:shd w:fill="F4FAF6" w:val="clear"/>
+            <w:tcMar>
+              <w:top w:type="dxa" w:w="80"/>
+              <w:left w:type="dxa" w:w="120"/>
+              <w:bottom w:type="dxa" w:w="80"/>
+              <w:right w:type="dxa" w:w="120"/>
+            </w:tcMar>
+            <w:vAlign w:val="center"/>
+          </w:tcPr>
+          <w:p>
+            <w:r>
+              <w:rPr>
+                <w:rFonts w:ascii="Consolas" w:cs="Consolas" w:eastAsia="Consolas" w:hAnsi="Consolas"/>
+                <w:b w:val="false"/>
+                <w:bCs w:val="false"/>
+                <w:color w:val="4A6358"/>
+                <w:sz w:val="17"/>
+                <w:szCs w:val="17"/>
+              </w:rPr>
+              <w:t xml:space="preserve">DATE</w:t>
+            </w:r>
+          </w:p>
+        </w:tc>
+        <w:tc>
+          <w:tcPr>
+            <w:tcW w:type="dxa" w:w="5000"/>
+            <w:tcBorders>
+              <w:top w:val="single" w:color="C8E6D4" w:sz="4"/>
+              <w:left w:val="single" w:color="C8E6D4" w:sz="4"/>
+              <w:bottom w:val="single" w:color="C8E6D4" w:sz="4"/>
+              <w:right w:val="single" w:color="C8E6D4" w:sz="4"/>
+            </w:tcBorders>
+            <w:shd w:fill="F4FAF6" w:val="clear"/>
+            <w:tcMar>
+              <w:top w:type="dxa" w:w="80"/>
+              <w:left w:type="dxa" w:w="120"/>
+              <w:bottom w:type="dxa" w:w="80"/>
+              <w:right w:type="dxa" w:w="120"/>
+            </w:tcMar>
+            <w:vAlign w:val="center"/>
+          </w:tcPr>
+          <w:p>
+            <w:r>
+              <w:rPr>
+                <w:rFonts w:ascii="Arial" w:cs="Arial" w:eastAsia="Arial" w:hAnsi="Arial"/>
+                <w:b w:val="false"/>
+                <w:bCs w:val="false"/>
+                <w:color w:val="1A2E22"/>
+                <w:sz w:val="17"/>
+                <w:szCs w:val="17"/>
+              </w:rPr>
+              <w:t xml:space="preserve">Data de validade que o alimento tinha</w:t>
+            </w:r>
+          </w:p>
+        </w:tc>
+      </w:tr>
+      <w:tr>
+        <w:tc>
+          <w:tcPr>
+            <w:tcW w:type="dxa" w:w="1900"/>
+            <w:tcBorders>
+              <w:top w:val="single" w:color="C8E6D4" w:sz="4"/>
+              <w:left w:val="single" w:color="C8E6D4" w:sz="4"/>
+              <w:bottom w:val="single" w:color="C8E6D4" w:sz="4"/>
+              <w:right w:val="single" w:color="C8E6D4" w:sz="4"/>
+            </w:tcBorders>
+            <w:shd w:fill="FFFFFF" w:val="clear"/>
+            <w:tcMar>
+              <w:top w:type="dxa" w:w="80"/>
+              <w:left w:type="dxa" w:w="120"/>
+              <w:bottom w:type="dxa" w:w="80"/>
+              <w:right w:type="dxa" w:w="120"/>
+            </w:tcMar>
+            <w:vAlign w:val="center"/>
+          </w:tcPr>
+          <w:p>
+            <w:r>
+              <w:rPr>
+                <w:rFonts w:ascii="Consolas" w:cs="Consolas" w:eastAsia="Consolas" w:hAnsi="Consolas"/>
+                <w:b/>
+                <w:bCs/>
+                <w:color w:val="2D6A4F"/>
+                <w:sz w:val="17"/>
+                <w:szCs w:val="17"/>
+              </w:rPr>
+              <w:t xml:space="preserve">local_armazenamento</w:t>
+            </w:r>
+          </w:p>
+        </w:tc>
+        <w:tc>
+          <w:tcPr>
+            <w:tcW w:type="dxa" w:w="1900"/>
+            <w:tcBorders>
+              <w:top w:val="single" w:color="C8E6D4" w:sz="4"/>
+              <w:left w:val="single" w:color="C8E6D4" w:sz="4"/>
+              <w:bottom w:val="single" w:color="C8E6D4" w:sz="4"/>
+              <w:right w:val="single" w:color="C8E6D4" w:sz="4"/>
+            </w:tcBorders>
+            <w:shd w:fill="FFFFFF" w:val="clear"/>
+            <w:tcMar>
+              <w:top w:type="dxa" w:w="80"/>
+              <w:left w:type="dxa" w:w="120"/>
+              <w:bottom w:type="dxa" w:w="80"/>
+              <w:right w:type="dxa" w:w="120"/>
+            </w:tcMar>
+            <w:vAlign w:val="center"/>
+          </w:tcPr>
+          <w:p>
+            <w:r>
+              <w:rPr>
+                <w:rFonts w:ascii="Consolas" w:cs="Consolas" w:eastAsia="Consolas" w:hAnsi="Consolas"/>
+                <w:b w:val="false"/>
+                <w:bCs w:val="false"/>
+                <w:color w:val="4A6358"/>
+                <w:sz w:val="17"/>
+                <w:szCs w:val="17"/>
+              </w:rPr>
+              <w:t xml:space="preserve">VARCHAR(50)</w:t>
+            </w:r>
+          </w:p>
+        </w:tc>
+        <w:tc>
+          <w:tcPr>
+            <w:tcW w:type="dxa" w:w="5000"/>
+            <w:tcBorders>
+              <w:top w:val="single" w:color="C8E6D4" w:sz="4"/>
+              <w:left w:val="single" w:color="C8E6D4" w:sz="4"/>
+              <w:bottom w:val="single" w:color="C8E6D4" w:sz="4"/>
+              <w:right w:val="single" w:color="C8E6D4" w:sz="4"/>
+            </w:tcBorders>
+            <w:shd w:fill="FFFFFF" w:val="clear"/>
+            <w:tcMar>
+              <w:top w:type="dxa" w:w="80"/>
+              <w:left w:type="dxa" w:w="120"/>
+              <w:bottom w:type="dxa" w:w="80"/>
+              <w:right w:type="dxa" w:w="120"/>
+            </w:tcMar>
+            <w:vAlign w:val="center"/>
+          </w:tcPr>
+          <w:p>
+            <w:r>
+              <w:rPr>
+                <w:rFonts w:ascii="Arial" w:cs="Arial" w:eastAsia="Arial" w:hAnsi="Arial"/>
+                <w:b w:val="false"/>
+                <w:bCs w:val="false"/>
+                <w:color w:val="1A2E22"/>
+                <w:sz w:val="17"/>
+                <w:szCs w:val="17"/>
+              </w:rPr>
+              <w:t xml:space="preserve">Local de guarda que o alimento tinha</w:t>
+            </w:r>
+          </w:p>
+        </w:tc>
+      </w:tr>
+      <w:tr>
+        <w:tc>
+          <w:tcPr>
+            <w:tcW w:type="dxa" w:w="1900"/>
+            <w:tcBorders>
+              <w:top w:val="single" w:color="C8E6D4" w:sz="4"/>
+              <w:left w:val="single" w:color="C8E6D4" w:sz="4"/>
+              <w:bottom w:val="single" w:color="C8E6D4" w:sz="4"/>
+              <w:right w:val="single" w:color="C8E6D4" w:sz="4"/>
+            </w:tcBorders>
+            <w:shd w:fill="F4FAF6" w:val="clear"/>
+            <w:tcMar>
+              <w:top w:type="dxa" w:w="80"/>
+              <w:left w:type="dxa" w:w="120"/>
+              <w:bottom w:type="dxa" w:w="80"/>
+              <w:right w:type="dxa" w:w="120"/>
+            </w:tcMar>
+            <w:vAlign w:val="center"/>
+          </w:tcPr>
+          <w:p>
+            <w:r>
+              <w:rPr>
+                <w:rFonts w:ascii="Consolas" w:cs="Consolas" w:eastAsia="Consolas" w:hAnsi="Consolas"/>
+                <w:b/>
+                <w:bCs/>
+                <w:color w:val="2D6A4F"/>
+                <w:sz w:val="17"/>
+                <w:szCs w:val="17"/>
+              </w:rPr>
+              <w:t xml:space="preserve">status_saida</w:t>
+            </w:r>
+          </w:p>
+        </w:tc>
+        <w:tc>
+          <w:tcPr>
+            <w:tcW w:type="dxa" w:w="1900"/>
+            <w:tcBorders>
+              <w:top w:val="single" w:color="C8E6D4" w:sz="4"/>
+              <w:left w:val="single" w:color="C8E6D4" w:sz="4"/>
+              <w:bottom w:val="single" w:color="C8E6D4" w:sz="4"/>
+              <w:right w:val="single" w:color="C8E6D4" w:sz="4"/>
+            </w:tcBorders>
+            <w:shd w:fill="F4FAF6" w:val="clear"/>
+            <w:tcMar>
+              <w:top w:type="dxa" w:w="80"/>
+              <w:left w:type="dxa" w:w="120"/>
+              <w:bottom w:type="dxa" w:w="80"/>
+              <w:right w:type="dxa" w:w="120"/>
+            </w:tcMar>
+            <w:vAlign w:val="center"/>
+          </w:tcPr>
+          <w:p>
+            <w:r>
+              <w:rPr>
+                <w:rFonts w:ascii="Consolas" w:cs="Consolas" w:eastAsia="Consolas" w:hAnsi="Consolas"/>
+                <w:b w:val="false"/>
+                <w:bCs w:val="false"/>
+                <w:color w:val="4A6358"/>
+                <w:sz w:val="17"/>
+                <w:szCs w:val="17"/>
+              </w:rPr>
+              <w:t xml:space="preserve">VARCHAR(20)</w:t>
+            </w:r>
+          </w:p>
+        </w:tc>
+        <w:tc>
+          <w:tcPr>
+            <w:tcW w:type="dxa" w:w="5000"/>
+            <w:tcBorders>
+              <w:top w:val="single" w:color="C8E6D4" w:sz="4"/>
+              <w:left w:val="single" w:color="C8E6D4" w:sz="4"/>
+              <w:bottom w:val="single" w:color="C8E6D4" w:sz="4"/>
+              <w:right w:val="single" w:color="C8E6D4" w:sz="4"/>
+            </w:tcBorders>
+            <w:shd w:fill="F4FAF6" w:val="clear"/>
+            <w:tcMar>
+              <w:top w:type="dxa" w:w="80"/>
+              <w:left w:type="dxa" w:w="120"/>
+              <w:bottom w:type="dxa" w:w="80"/>
+              <w:right w:type="dxa" w:w="120"/>
+            </w:tcMar>
+            <w:vAlign w:val="center"/>
+          </w:tcPr>
+          <w:p>
+            <w:r>
+              <w:rPr>
+                <w:rFonts w:ascii="Arial" w:cs="Arial" w:eastAsia="Arial" w:hAnsi="Arial"/>
+                <w:b w:val="false"/>
+                <w:bCs w:val="false"/>
+                <w:color w:val="1A2E22"/>
+                <w:sz w:val="17"/>
+                <w:szCs w:val="17"/>
+              </w:rPr>
+              <w:t xml:space="preserve">Motivo da saída — restrição CHECK aceita apenas "consumido" ou "descartado"</w:t>
+            </w:r>
+          </w:p>
+        </w:tc>
+      </w:tr>
+      <w:tr>
+        <w:tc>
+          <w:tcPr>
+            <w:tcW w:type="dxa" w:w="1900"/>
+            <w:tcBorders>
+              <w:top w:val="single" w:color="C8E6D4" w:sz="4"/>
+              <w:left w:val="single" w:color="C8E6D4" w:sz="4"/>
+              <w:bottom w:val="single" w:color="C8E6D4" w:sz="4"/>
+              <w:right w:val="single" w:color="C8E6D4" w:sz="4"/>
+            </w:tcBorders>
+            <w:shd w:fill="FFFFFF" w:val="clear"/>
+            <w:tcMar>
+              <w:top w:type="dxa" w:w="80"/>
+              <w:left w:type="dxa" w:w="120"/>
+              <w:bottom w:type="dxa" w:w="80"/>
+              <w:right w:type="dxa" w:w="120"/>
+            </w:tcMar>
+            <w:vAlign w:val="center"/>
+          </w:tcPr>
+          <w:p>
+            <w:r>
+              <w:rPr>
+                <w:rFonts w:ascii="Consolas" w:cs="Consolas" w:eastAsia="Consolas" w:hAnsi="Consolas"/>
+                <w:b/>
+                <w:bCs/>
+                <w:color w:val="2D6A4F"/>
+                <w:sz w:val="17"/>
+                <w:szCs w:val="17"/>
+              </w:rPr>
+              <w:t xml:space="preserve">data_saida</w:t>
+            </w:r>
+          </w:p>
+        </w:tc>
+        <w:tc>
+          <w:tcPr>
+            <w:tcW w:type="dxa" w:w="1900"/>
+            <w:tcBorders>
+              <w:top w:val="single" w:color="C8E6D4" w:sz="4"/>
+              <w:left w:val="single" w:color="C8E6D4" w:sz="4"/>
+              <w:bottom w:val="single" w:color="C8E6D4" w:sz="4"/>
+              <w:right w:val="single" w:color="C8E6D4" w:sz="4"/>
+            </w:tcBorders>
+            <w:shd w:fill="FFFFFF" w:val="clear"/>
+            <w:tcMar>
+              <w:top w:type="dxa" w:w="80"/>
+              <w:left w:type="dxa" w:w="120"/>
+              <w:bottom w:type="dxa" w:w="80"/>
+              <w:right w:type="dxa" w:w="120"/>
+            </w:tcMar>
+            <w:vAlign w:val="center"/>
+          </w:tcPr>
+          <w:p>
+            <w:r>
+              <w:rPr>
+                <w:rFonts w:ascii="Consolas" w:cs="Consolas" w:eastAsia="Consolas" w:hAnsi="Consolas"/>
+                <w:b w:val="false"/>
+                <w:bCs w:val="false"/>
+                <w:color w:val="4A6358"/>
+                <w:sz w:val="17"/>
+                <w:szCs w:val="17"/>
+              </w:rPr>
+              <w:t xml:space="preserve">TIMESTAMP</w:t>
+            </w:r>
+          </w:p>
+        </w:tc>
+        <w:tc>
+          <w:tcPr>
+            <w:tcW w:type="dxa" w:w="5000"/>
+            <w:tcBorders>
+              <w:top w:val="single" w:color="C8E6D4" w:sz="4"/>
+              <w:left w:val="single" w:color="C8E6D4" w:sz="4"/>
+              <w:bottom w:val="single" w:color="C8E6D4" w:sz="4"/>
+              <w:right w:val="single" w:color="C8E6D4" w:sz="4"/>
+            </w:tcBorders>
+            <w:shd w:fill="FFFFFF" w:val="clear"/>
+            <w:tcMar>
+              <w:top w:type="dxa" w:w="80"/>
+              <w:left w:type="dxa" w:w="120"/>
+              <w:bottom w:type="dxa" w:w="80"/>
+              <w:right w:type="dxa" w:w="120"/>
+            </w:tcMar>
+            <w:vAlign w:val="center"/>
+          </w:tcPr>
+          <w:p>
+            <w:r>
+              <w:rPr>
+                <w:rFonts w:ascii="Arial" w:cs="Arial" w:eastAsia="Arial" w:hAnsi="Arial"/>
+                <w:b w:val="false"/>
+                <w:bCs w:val="false"/>
+                <w:color w:val="1A2E22"/>
+                <w:sz w:val="17"/>
+                <w:szCs w:val="17"/>
+              </w:rPr>
+              <w:t xml:space="preserve">Data e hora em que o alimento saiu da despensa</w:t>
+            </w:r>
+          </w:p>
+        </w:tc>
+      </w:tr>
+      <w:tr>
+        <w:tc>
+          <w:tcPr>
+            <w:tcW w:type="dxa" w:w="1900"/>
+            <w:tcBorders>
+              <w:top w:val="single" w:color="C8E6D4" w:sz="4"/>
+              <w:left w:val="single" w:color="C8E6D4" w:sz="4"/>
+              <w:bottom w:val="single" w:color="C8E6D4" w:sz="4"/>
+              <w:right w:val="single" w:color="C8E6D4" w:sz="4"/>
+            </w:tcBorders>
+            <w:shd w:fill="F4FAF6" w:val="clear"/>
+            <w:tcMar>
+              <w:top w:type="dxa" w:w="80"/>
+              <w:left w:type="dxa" w:w="120"/>
+              <w:bottom w:type="dxa" w:w="80"/>
+              <w:right w:type="dxa" w:w="120"/>
+            </w:tcMar>
+            <w:vAlign w:val="center"/>
+          </w:tcPr>
+          <w:p>
+            <w:r>
+              <w:rPr>
+                <w:rFonts w:ascii="Consolas" w:cs="Consolas" w:eastAsia="Consolas" w:hAnsi="Consolas"/>
+                <w:b/>
+                <w:bCs/>
+                <w:color w:val="2D6A4F"/>
+                <w:sz w:val="17"/>
+                <w:szCs w:val="17"/>
+              </w:rPr>
+              <w:t xml:space="preserve">criado_em</w:t>
+            </w:r>
+          </w:p>
+        </w:tc>
+        <w:tc>
+          <w:tcPr>
+            <w:tcW w:type="dxa" w:w="1900"/>
+            <w:tcBorders>
+              <w:top w:val="single" w:color="C8E6D4" w:sz="4"/>
+              <w:left w:val="single" w:color="C8E6D4" w:sz="4"/>
+              <w:bottom w:val="single" w:color="C8E6D4" w:sz="4"/>
+              <w:right w:val="single" w:color="C8E6D4" w:sz="4"/>
+            </w:tcBorders>
+            <w:shd w:fill="F4FAF6" w:val="clear"/>
+            <w:tcMar>
+              <w:top w:type="dxa" w:w="80"/>
+              <w:left w:type="dxa" w:w="120"/>
+              <w:bottom w:type="dxa" w:w="80"/>
+              <w:right w:type="dxa" w:w="120"/>
+            </w:tcMar>
+            <w:vAlign w:val="center"/>
+          </w:tcPr>
+          <w:p>
+            <w:r>
+              <w:rPr>
+                <w:rFonts w:ascii="Consolas" w:cs="Consolas" w:eastAsia="Consolas" w:hAnsi="Consolas"/>
+                <w:b w:val="false"/>
+                <w:bCs w:val="false"/>
+                <w:color w:val="4A6358"/>
+                <w:sz w:val="17"/>
+                <w:szCs w:val="17"/>
+              </w:rPr>
+              <w:t xml:space="preserve">TIMESTAMP</w:t>
+            </w:r>
+          </w:p>
+        </w:tc>
+        <w:tc>
+          <w:tcPr>
+            <w:tcW w:type="dxa" w:w="5000"/>
+            <w:tcBorders>
+              <w:top w:val="single" w:color="C8E6D4" w:sz="4"/>
+              <w:left w:val="single" w:color="C8E6D4" w:sz="4"/>
+              <w:bottom w:val="single" w:color="C8E6D4" w:sz="4"/>
+              <w:right w:val="single" w:color="C8E6D4" w:sz="4"/>
+            </w:tcBorders>
+            <w:shd w:fill="F4FAF6" w:val="clear"/>
+            <w:tcMar>
+              <w:top w:type="dxa" w:w="80"/>
+              <w:left w:type="dxa" w:w="120"/>
+              <w:bottom w:type="dxa" w:w="80"/>
+              <w:right w:type="dxa" w:w="120"/>
+            </w:tcMar>
+            <w:vAlign w:val="center"/>
+          </w:tcPr>
+          <w:p>
+            <w:r>
+              <w:rPr>
+                <w:rFonts w:ascii="Arial" w:cs="Arial" w:eastAsia="Arial" w:hAnsi="Arial"/>
+                <w:b w:val="false"/>
+                <w:bCs w:val="false"/>
+                <w:color w:val="1A2E22"/>
+                <w:sz w:val="17"/>
+                <w:szCs w:val="17"/>
+              </w:rPr>
+              <w:t xml:space="preserve">Data e hora do cadastro original do alimento (copiada de ALIMENTOS)</w:t>
+            </w:r>
+          </w:p>
+        </w:tc>
+      </w:tr>
+    </w:tbl>
+    <w:p>
+      <w:pPr>
+        <w:spacing w:after="100" w:before="240"/>
+      </w:pPr>
+      <w:r>
+        <w:rPr>
+          <w:rFonts w:ascii="Arial" w:cs="Arial" w:eastAsia="Arial" w:hAnsi="Arial"/>
+          <w:b/>
+          <w:bCs/>
+          <w:color w:val="2D6A4F"/>
+          <w:sz w:val="22"/>
+          <w:szCs w:val="22"/>
+        </w:rPr>
+        <w:t xml:space="preserve">3.4  Entidade: LISTA_COMPRAS</w:t>
+      </w:r>
+    </w:p>
+    <w:p>
+      <w:pPr>
+        <w:spacing w:after="140" w:line="300"/>
+        <w:jc w:val="both"/>
+      </w:pPr>
+      <w:r>
+        <w:rPr>
+          <w:rFonts w:ascii="Arial" w:cs="Arial" w:eastAsia="Arial" w:hAnsi="Arial"/>
+          <w:color w:val="1A2E22"/>
+          <w:sz w:val="20"/>
+          <w:szCs w:val="20"/>
+        </w:rPr>
+        <w:t xml:space="preserve">Representa os itens da lista de compras do usuário (US-11) — adicionados manualmente ou aceitos a partir de uma sugestão automática calculada sobre HISTORICO_ALIMENTOS.</w:t>
+      </w:r>
+    </w:p>
+    <w:tbl>
+      <w:tblPr>
+        <w:tblW w:type="dxa" w:w="8800"/>
+        <w:tblBorders>
+          <w:top w:val="single" w:color="auto" w:sz="4"/>
+          <w:left w:val="single" w:color="auto" w:sz="4"/>
+          <w:bottom w:val="single" w:color="auto" w:sz="4"/>
+          <w:right w:val="single" w:color="auto" w:sz="4"/>
+          <w:insideH w:val="single" w:color="auto" w:sz="4"/>
+          <w:insideV w:val="single" w:color="auto" w:sz="4"/>
+        </w:tblBorders>
+      </w:tblPr>
+      <w:tblGrid>
+        <w:gridCol w:w="1900"/>
+        <w:gridCol w:w="1900"/>
+        <w:gridCol w:w="5000"/>
+      </w:tblGrid>
+      <w:tr>
+        <w:trPr>
+          <w:tblHeader/>
+        </w:trPr>
+        <w:tc>
+          <w:tcPr>
+            <w:tcW w:type="dxa" w:w="1900"/>
+            <w:tcBorders>
+              <w:top w:val="single" w:color="2D6A4F" w:sz="4"/>
+              <w:left w:val="single" w:color="2D6A4F" w:sz="4"/>
+              <w:bottom w:val="single" w:color="2D6A4F" w:sz="4"/>
+              <w:right w:val="single" w:color="2D6A4F" w:sz="4"/>
+            </w:tcBorders>
+            <w:shd w:fill="2D6A4F" w:val="clear"/>
+            <w:tcMar>
+              <w:top w:type="dxa" w:w="80"/>
+              <w:left w:type="dxa" w:w="120"/>
+              <w:bottom w:type="dxa" w:w="80"/>
+              <w:right w:type="dxa" w:w="120"/>
+            </w:tcMar>
+            <w:vAlign w:val="center"/>
+          </w:tcPr>
+          <w:p>
+            <w:pPr>
+              <w:jc w:val="left"/>
+            </w:pPr>
+            <w:r>
+              <w:rPr>
+                <w:rFonts w:ascii="Arial" w:cs="Arial" w:eastAsia="Arial" w:hAnsi="Arial"/>
+                <w:b/>
+                <w:bCs/>
+                <w:color w:val="FFFFFF"/>
+                <w:sz w:val="18"/>
+                <w:szCs w:val="18"/>
+              </w:rPr>
+              <w:t xml:space="preserve">Atributo</w:t>
+            </w:r>
+          </w:p>
+        </w:tc>
+        <w:tc>
+          <w:tcPr>
+            <w:tcW w:type="dxa" w:w="1900"/>
+            <w:tcBorders>
+              <w:top w:val="single" w:color="2D6A4F" w:sz="4"/>
+              <w:left w:val="single" w:color="2D6A4F" w:sz="4"/>
+              <w:bottom w:val="single" w:color="2D6A4F" w:sz="4"/>
+              <w:right w:val="single" w:color="2D6A4F" w:sz="4"/>
+            </w:tcBorders>
+            <w:shd w:fill="2D6A4F" w:val="clear"/>
+            <w:tcMar>
+              <w:top w:type="dxa" w:w="80"/>
+              <w:left w:type="dxa" w:w="120"/>
+              <w:bottom w:type="dxa" w:w="80"/>
+              <w:right w:type="dxa" w:w="120"/>
+            </w:tcMar>
+            <w:vAlign w:val="center"/>
+          </w:tcPr>
+          <w:p>
+            <w:pPr>
+              <w:jc w:val="left"/>
+            </w:pPr>
+            <w:r>
+              <w:rPr>
+                <w:rFonts w:ascii="Arial" w:cs="Arial" w:eastAsia="Arial" w:hAnsi="Arial"/>
+                <w:b/>
+                <w:bCs/>
+                <w:color w:val="FFFFFF"/>
+                <w:sz w:val="18"/>
+                <w:szCs w:val="18"/>
+              </w:rPr>
+              <w:t xml:space="preserve">Tipo</w:t>
+            </w:r>
+          </w:p>
+        </w:tc>
+        <w:tc>
+          <w:tcPr>
+            <w:tcW w:type="dxa" w:w="5000"/>
+            <w:tcBorders>
+              <w:top w:val="single" w:color="2D6A4F" w:sz="4"/>
+              <w:left w:val="single" w:color="2D6A4F" w:sz="4"/>
+              <w:bottom w:val="single" w:color="2D6A4F" w:sz="4"/>
+              <w:right w:val="single" w:color="2D6A4F" w:sz="4"/>
+            </w:tcBorders>
+            <w:shd w:fill="2D6A4F" w:val="clear"/>
+            <w:tcMar>
+              <w:top w:type="dxa" w:w="80"/>
+              <w:left w:type="dxa" w:w="120"/>
+              <w:bottom w:type="dxa" w:w="80"/>
+              <w:right w:type="dxa" w:w="120"/>
+            </w:tcMar>
+            <w:vAlign w:val="center"/>
+          </w:tcPr>
+          <w:p>
+            <w:pPr>
+              <w:jc w:val="left"/>
+            </w:pPr>
+            <w:r>
+              <w:rPr>
+                <w:rFonts w:ascii="Arial" w:cs="Arial" w:eastAsia="Arial" w:hAnsi="Arial"/>
+                <w:b/>
+                <w:bCs/>
+                <w:color w:val="FFFFFF"/>
+                <w:sz w:val="18"/>
+                <w:szCs w:val="18"/>
+              </w:rPr>
+              <w:t xml:space="preserve">Descrição</w:t>
+            </w:r>
+          </w:p>
+        </w:tc>
+      </w:tr>
+      <w:tr>
+        <w:tc>
+          <w:tcPr>
+            <w:tcW w:type="dxa" w:w="1900"/>
+            <w:tcBorders>
+              <w:top w:val="single" w:color="C8E6D4" w:sz="4"/>
+              <w:left w:val="single" w:color="C8E6D4" w:sz="4"/>
+              <w:bottom w:val="single" w:color="C8E6D4" w:sz="4"/>
+              <w:right w:val="single" w:color="C8E6D4" w:sz="4"/>
+            </w:tcBorders>
+            <w:shd w:fill="FFFFFF" w:val="clear"/>
+            <w:tcMar>
+              <w:top w:type="dxa" w:w="80"/>
+              <w:left w:type="dxa" w:w="120"/>
+              <w:bottom w:type="dxa" w:w="80"/>
+              <w:right w:type="dxa" w:w="120"/>
+            </w:tcMar>
+            <w:vAlign w:val="center"/>
+          </w:tcPr>
+          <w:p>
+            <w:r>
+              <w:rPr>
+                <w:rFonts w:ascii="Consolas" w:cs="Consolas" w:eastAsia="Consolas" w:hAnsi="Consolas"/>
+                <w:b/>
+                <w:bCs/>
+                <w:color w:val="2D6A4F"/>
+                <w:sz w:val="17"/>
+                <w:szCs w:val="17"/>
+              </w:rPr>
+              <w:t xml:space="preserve">id</w:t>
+            </w:r>
+          </w:p>
+        </w:tc>
+        <w:tc>
+          <w:tcPr>
+            <w:tcW w:type="dxa" w:w="1900"/>
+            <w:tcBorders>
+              <w:top w:val="single" w:color="C8E6D4" w:sz="4"/>
+              <w:left w:val="single" w:color="C8E6D4" w:sz="4"/>
+              <w:bottom w:val="single" w:color="C8E6D4" w:sz="4"/>
+              <w:right w:val="single" w:color="C8E6D4" w:sz="4"/>
+            </w:tcBorders>
+            <w:shd w:fill="FFFFFF" w:val="clear"/>
+            <w:tcMar>
+              <w:top w:type="dxa" w:w="80"/>
+              <w:left w:type="dxa" w:w="120"/>
+              <w:bottom w:type="dxa" w:w="80"/>
+              <w:right w:type="dxa" w:w="120"/>
+            </w:tcMar>
+            <w:vAlign w:val="center"/>
+          </w:tcPr>
+          <w:p>
+            <w:r>
+              <w:rPr>
+                <w:rFonts w:ascii="Consolas" w:cs="Consolas" w:eastAsia="Consolas" w:hAnsi="Consolas"/>
+                <w:b w:val="false"/>
+                <w:bCs w:val="false"/>
+                <w:color w:val="4A6358"/>
+                <w:sz w:val="17"/>
+                <w:szCs w:val="17"/>
+              </w:rPr>
+              <w:t xml:space="preserve">SERIAL</w:t>
+            </w:r>
+          </w:p>
+        </w:tc>
+        <w:tc>
+          <w:tcPr>
+            <w:tcW w:type="dxa" w:w="5000"/>
+            <w:tcBorders>
+              <w:top w:val="single" w:color="C8E6D4" w:sz="4"/>
+              <w:left w:val="single" w:color="C8E6D4" w:sz="4"/>
+              <w:bottom w:val="single" w:color="C8E6D4" w:sz="4"/>
+              <w:right w:val="single" w:color="C8E6D4" w:sz="4"/>
+            </w:tcBorders>
+            <w:shd w:fill="FFFFFF" w:val="clear"/>
+            <w:tcMar>
+              <w:top w:type="dxa" w:w="80"/>
+              <w:left w:type="dxa" w:w="120"/>
+              <w:bottom w:type="dxa" w:w="80"/>
+              <w:right w:type="dxa" w:w="120"/>
+            </w:tcMar>
+            <w:vAlign w:val="center"/>
+          </w:tcPr>
+          <w:p>
+            <w:r>
+              <w:rPr>
+                <w:rFonts w:ascii="Arial" w:cs="Arial" w:eastAsia="Arial" w:hAnsi="Arial"/>
+                <w:b w:val="false"/>
+                <w:bCs w:val="false"/>
+                <w:color w:val="1A2E22"/>
+                <w:sz w:val="17"/>
+                <w:szCs w:val="17"/>
+              </w:rPr>
+              <w:t xml:space="preserve">Identificador único do item (chave primária)</w:t>
+            </w:r>
+          </w:p>
+        </w:tc>
+      </w:tr>
+      <w:tr>
+        <w:tc>
+          <w:tcPr>
+            <w:tcW w:type="dxa" w:w="1900"/>
+            <w:tcBorders>
+              <w:top w:val="single" w:color="C8E6D4" w:sz="4"/>
+              <w:left w:val="single" w:color="C8E6D4" w:sz="4"/>
+              <w:bottom w:val="single" w:color="C8E6D4" w:sz="4"/>
+              <w:right w:val="single" w:color="C8E6D4" w:sz="4"/>
+            </w:tcBorders>
+            <w:shd w:fill="F4FAF6" w:val="clear"/>
+            <w:tcMar>
+              <w:top w:type="dxa" w:w="80"/>
+              <w:left w:type="dxa" w:w="120"/>
+              <w:bottom w:type="dxa" w:w="80"/>
+              <w:right w:type="dxa" w:w="120"/>
+            </w:tcMar>
+            <w:vAlign w:val="center"/>
+          </w:tcPr>
+          <w:p>
+            <w:r>
+              <w:rPr>
+                <w:rFonts w:ascii="Consolas" w:cs="Consolas" w:eastAsia="Consolas" w:hAnsi="Consolas"/>
+                <w:b/>
+                <w:bCs/>
+                <w:color w:val="2D6A4F"/>
+                <w:sz w:val="17"/>
+                <w:szCs w:val="17"/>
+              </w:rPr>
+              <w:t xml:space="preserve">nome</w:t>
+            </w:r>
+          </w:p>
+        </w:tc>
+        <w:tc>
+          <w:tcPr>
+            <w:tcW w:type="dxa" w:w="1900"/>
+            <w:tcBorders>
+              <w:top w:val="single" w:color="C8E6D4" w:sz="4"/>
+              <w:left w:val="single" w:color="C8E6D4" w:sz="4"/>
+              <w:bottom w:val="single" w:color="C8E6D4" w:sz="4"/>
+              <w:right w:val="single" w:color="C8E6D4" w:sz="4"/>
+            </w:tcBorders>
+            <w:shd w:fill="F4FAF6" w:val="clear"/>
+            <w:tcMar>
+              <w:top w:type="dxa" w:w="80"/>
+              <w:left w:type="dxa" w:w="120"/>
+              <w:bottom w:type="dxa" w:w="80"/>
+              <w:right w:type="dxa" w:w="120"/>
+            </w:tcMar>
+            <w:vAlign w:val="center"/>
+          </w:tcPr>
+          <w:p>
+            <w:r>
+              <w:rPr>
+                <w:rFonts w:ascii="Consolas" w:cs="Consolas" w:eastAsia="Consolas" w:hAnsi="Consolas"/>
+                <w:b w:val="false"/>
+                <w:bCs w:val="false"/>
+                <w:color w:val="4A6358"/>
+                <w:sz w:val="17"/>
+                <w:szCs w:val="17"/>
+              </w:rPr>
+              <w:t xml:space="preserve">VARCHAR(100)</w:t>
+            </w:r>
+          </w:p>
+        </w:tc>
+        <w:tc>
+          <w:tcPr>
+            <w:tcW w:type="dxa" w:w="5000"/>
+            <w:tcBorders>
+              <w:top w:val="single" w:color="C8E6D4" w:sz="4"/>
+              <w:left w:val="single" w:color="C8E6D4" w:sz="4"/>
+              <w:bottom w:val="single" w:color="C8E6D4" w:sz="4"/>
+              <w:right w:val="single" w:color="C8E6D4" w:sz="4"/>
+            </w:tcBorders>
+            <w:shd w:fill="F4FAF6" w:val="clear"/>
+            <w:tcMar>
+              <w:top w:type="dxa" w:w="80"/>
+              <w:left w:type="dxa" w:w="120"/>
+              <w:bottom w:type="dxa" w:w="80"/>
+              <w:right w:type="dxa" w:w="120"/>
+            </w:tcMar>
+            <w:vAlign w:val="center"/>
+          </w:tcPr>
+          <w:p>
+            <w:r>
+              <w:rPr>
+                <w:rFonts w:ascii="Arial" w:cs="Arial" w:eastAsia="Arial" w:hAnsi="Arial"/>
+                <w:b w:val="false"/>
+                <w:bCs w:val="false"/>
+                <w:color w:val="1A2E22"/>
+                <w:sz w:val="17"/>
+                <w:szCs w:val="17"/>
+              </w:rPr>
+              <w:t xml:space="preserve">Nome do item — restrição CHECK impede nome vazio</w:t>
+            </w:r>
+          </w:p>
+        </w:tc>
+      </w:tr>
+      <w:tr>
+        <w:tc>
+          <w:tcPr>
+            <w:tcW w:type="dxa" w:w="1900"/>
+            <w:tcBorders>
+              <w:top w:val="single" w:color="C8E6D4" w:sz="4"/>
+              <w:left w:val="single" w:color="C8E6D4" w:sz="4"/>
+              <w:bottom w:val="single" w:color="C8E6D4" w:sz="4"/>
+              <w:right w:val="single" w:color="C8E6D4" w:sz="4"/>
+            </w:tcBorders>
+            <w:shd w:fill="FFFFFF" w:val="clear"/>
+            <w:tcMar>
+              <w:top w:type="dxa" w:w="80"/>
+              <w:left w:type="dxa" w:w="120"/>
+              <w:bottom w:type="dxa" w:w="80"/>
+              <w:right w:type="dxa" w:w="120"/>
+            </w:tcMar>
+            <w:vAlign w:val="center"/>
+          </w:tcPr>
+          <w:p>
+            <w:r>
+              <w:rPr>
+                <w:rFonts w:ascii="Consolas" w:cs="Consolas" w:eastAsia="Consolas" w:hAnsi="Consolas"/>
+                <w:b/>
+                <w:bCs/>
+                <w:color w:val="2D6A4F"/>
+                <w:sz w:val="17"/>
+                <w:szCs w:val="17"/>
+              </w:rPr>
+              <w:t xml:space="preserve">quantidade</w:t>
+            </w:r>
+          </w:p>
+        </w:tc>
+        <w:tc>
+          <w:tcPr>
+            <w:tcW w:type="dxa" w:w="1900"/>
+            <w:tcBorders>
+              <w:top w:val="single" w:color="C8E6D4" w:sz="4"/>
+              <w:left w:val="single" w:color="C8E6D4" w:sz="4"/>
+              <w:bottom w:val="single" w:color="C8E6D4" w:sz="4"/>
+              <w:right w:val="single" w:color="C8E6D4" w:sz="4"/>
+            </w:tcBorders>
+            <w:shd w:fill="FFFFFF" w:val="clear"/>
+            <w:tcMar>
+              <w:top w:type="dxa" w:w="80"/>
+              <w:left w:type="dxa" w:w="120"/>
+              <w:bottom w:type="dxa" w:w="80"/>
+              <w:right w:type="dxa" w:w="120"/>
+            </w:tcMar>
+            <w:vAlign w:val="center"/>
+          </w:tcPr>
+          <w:p>
+            <w:r>
+              <w:rPr>
+                <w:rFonts w:ascii="Consolas" w:cs="Consolas" w:eastAsia="Consolas" w:hAnsi="Consolas"/>
+                <w:b w:val="false"/>
+                <w:bCs w:val="false"/>
+                <w:color w:val="4A6358"/>
+                <w:sz w:val="17"/>
+                <w:szCs w:val="17"/>
+              </w:rPr>
+              <w:t xml:space="preserve">DECIMAL(10,2)</w:t>
+            </w:r>
+          </w:p>
+        </w:tc>
+        <w:tc>
+          <w:tcPr>
+            <w:tcW w:type="dxa" w:w="5000"/>
+            <w:tcBorders>
+              <w:top w:val="single" w:color="C8E6D4" w:sz="4"/>
+              <w:left w:val="single" w:color="C8E6D4" w:sz="4"/>
+              <w:bottom w:val="single" w:color="C8E6D4" w:sz="4"/>
+              <w:right w:val="single" w:color="C8E6D4" w:sz="4"/>
+            </w:tcBorders>
+            <w:shd w:fill="FFFFFF" w:val="clear"/>
+            <w:tcMar>
+              <w:top w:type="dxa" w:w="80"/>
+              <w:left w:type="dxa" w:w="120"/>
+              <w:bottom w:type="dxa" w:w="80"/>
+              <w:right w:type="dxa" w:w="120"/>
+            </w:tcMar>
+            <w:vAlign w:val="center"/>
+          </w:tcPr>
+          <w:p>
+            <w:r>
+              <w:rPr>
+                <w:rFonts w:ascii="Arial" w:cs="Arial" w:eastAsia="Arial" w:hAnsi="Arial"/>
+                <w:b w:val="false"/>
+                <w:bCs w:val="false"/>
+                <w:color w:val="1A2E22"/>
+                <w:sz w:val="17"/>
+                <w:szCs w:val="17"/>
+              </w:rPr>
+              <w:t xml:space="preserve">Quantidade desejada (opcional)</w:t>
+            </w:r>
+          </w:p>
+        </w:tc>
+      </w:tr>
+      <w:tr>
+        <w:tc>
+          <w:tcPr>
+            <w:tcW w:type="dxa" w:w="1900"/>
+            <w:tcBorders>
+              <w:top w:val="single" w:color="C8E6D4" w:sz="4"/>
+              <w:left w:val="single" w:color="C8E6D4" w:sz="4"/>
+              <w:bottom w:val="single" w:color="C8E6D4" w:sz="4"/>
+              <w:right w:val="single" w:color="C8E6D4" w:sz="4"/>
+            </w:tcBorders>
+            <w:shd w:fill="F4FAF6" w:val="clear"/>
+            <w:tcMar>
+              <w:top w:type="dxa" w:w="80"/>
+              <w:left w:type="dxa" w:w="120"/>
+              <w:bottom w:type="dxa" w:w="80"/>
+              <w:right w:type="dxa" w:w="120"/>
+            </w:tcMar>
+            <w:vAlign w:val="center"/>
+          </w:tcPr>
+          <w:p>
+            <w:r>
+              <w:rPr>
+                <w:rFonts w:ascii="Consolas" w:cs="Consolas" w:eastAsia="Consolas" w:hAnsi="Consolas"/>
+                <w:b/>
+                <w:bCs/>
+                <w:color w:val="2D6A4F"/>
+                <w:sz w:val="17"/>
+                <w:szCs w:val="17"/>
+              </w:rPr>
+              <w:t xml:space="preserve">unidade</w:t>
+            </w:r>
+          </w:p>
+        </w:tc>
+        <w:tc>
+          <w:tcPr>
+            <w:tcW w:type="dxa" w:w="1900"/>
+            <w:tcBorders>
+              <w:top w:val="single" w:color="C8E6D4" w:sz="4"/>
+              <w:left w:val="single" w:color="C8E6D4" w:sz="4"/>
+              <w:bottom w:val="single" w:color="C8E6D4" w:sz="4"/>
+              <w:right w:val="single" w:color="C8E6D4" w:sz="4"/>
+            </w:tcBorders>
+            <w:shd w:fill="F4FAF6" w:val="clear"/>
+            <w:tcMar>
+              <w:top w:type="dxa" w:w="80"/>
+              <w:left w:type="dxa" w:w="120"/>
+              <w:bottom w:type="dxa" w:w="80"/>
+              <w:right w:type="dxa" w:w="120"/>
+            </w:tcMar>
+            <w:vAlign w:val="center"/>
+          </w:tcPr>
+          <w:p>
+            <w:r>
+              <w:rPr>
+                <w:rFonts w:ascii="Consolas" w:cs="Consolas" w:eastAsia="Consolas" w:hAnsi="Consolas"/>
+                <w:b w:val="false"/>
+                <w:bCs w:val="false"/>
+                <w:color w:val="4A6358"/>
+                <w:sz w:val="17"/>
+                <w:szCs w:val="17"/>
+              </w:rPr>
+              <w:t xml:space="preserve">VARCHAR(20)</w:t>
+            </w:r>
+          </w:p>
+        </w:tc>
+        <w:tc>
+          <w:tcPr>
+            <w:tcW w:type="dxa" w:w="5000"/>
+            <w:tcBorders>
+              <w:top w:val="single" w:color="C8E6D4" w:sz="4"/>
+              <w:left w:val="single" w:color="C8E6D4" w:sz="4"/>
+              <w:bottom w:val="single" w:color="C8E6D4" w:sz="4"/>
+              <w:right w:val="single" w:color="C8E6D4" w:sz="4"/>
+            </w:tcBorders>
+            <w:shd w:fill="F4FAF6" w:val="clear"/>
+            <w:tcMar>
+              <w:top w:type="dxa" w:w="80"/>
+              <w:left w:type="dxa" w:w="120"/>
+              <w:bottom w:type="dxa" w:w="80"/>
+              <w:right w:type="dxa" w:w="120"/>
+            </w:tcMar>
+            <w:vAlign w:val="center"/>
+          </w:tcPr>
+          <w:p>
+            <w:r>
+              <w:rPr>
+                <w:rFonts w:ascii="Arial" w:cs="Arial" w:eastAsia="Arial" w:hAnsi="Arial"/>
+                <w:b w:val="false"/>
+                <w:bCs w:val="false"/>
+                <w:color w:val="1A2E22"/>
+                <w:sz w:val="17"/>
+                <w:szCs w:val="17"/>
+              </w:rPr>
+              <w:t xml:space="preserve">Unidade de medida (opcional)</w:t>
+            </w:r>
+          </w:p>
+        </w:tc>
+      </w:tr>
+      <w:tr>
+        <w:tc>
+          <w:tcPr>
+            <w:tcW w:type="dxa" w:w="1900"/>
+            <w:tcBorders>
+              <w:top w:val="single" w:color="C8E6D4" w:sz="4"/>
+              <w:left w:val="single" w:color="C8E6D4" w:sz="4"/>
+              <w:bottom w:val="single" w:color="C8E6D4" w:sz="4"/>
+              <w:right w:val="single" w:color="C8E6D4" w:sz="4"/>
+            </w:tcBorders>
+            <w:shd w:fill="FFFFFF" w:val="clear"/>
+            <w:tcMar>
+              <w:top w:type="dxa" w:w="80"/>
+              <w:left w:type="dxa" w:w="120"/>
+              <w:bottom w:type="dxa" w:w="80"/>
+              <w:right w:type="dxa" w:w="120"/>
+            </w:tcMar>
+            <w:vAlign w:val="center"/>
+          </w:tcPr>
+          <w:p>
+            <w:r>
+              <w:rPr>
+                <w:rFonts w:ascii="Consolas" w:cs="Consolas" w:eastAsia="Consolas" w:hAnsi="Consolas"/>
+                <w:b/>
+                <w:bCs/>
+                <w:color w:val="2D6A4F"/>
+                <w:sz w:val="17"/>
+                <w:szCs w:val="17"/>
+              </w:rPr>
+              <w:t xml:space="preserve">comprado</w:t>
+            </w:r>
+          </w:p>
+        </w:tc>
+        <w:tc>
+          <w:tcPr>
+            <w:tcW w:type="dxa" w:w="1900"/>
+            <w:tcBorders>
+              <w:top w:val="single" w:color="C8E6D4" w:sz="4"/>
+              <w:left w:val="single" w:color="C8E6D4" w:sz="4"/>
+              <w:bottom w:val="single" w:color="C8E6D4" w:sz="4"/>
+              <w:right w:val="single" w:color="C8E6D4" w:sz="4"/>
+            </w:tcBorders>
+            <w:shd w:fill="FFFFFF" w:val="clear"/>
+            <w:tcMar>
+              <w:top w:type="dxa" w:w="80"/>
+              <w:left w:type="dxa" w:w="120"/>
+              <w:bottom w:type="dxa" w:w="80"/>
+              <w:right w:type="dxa" w:w="120"/>
+            </w:tcMar>
+            <w:vAlign w:val="center"/>
+          </w:tcPr>
+          <w:p>
+            <w:r>
+              <w:rPr>
+                <w:rFonts w:ascii="Consolas" w:cs="Consolas" w:eastAsia="Consolas" w:hAnsi="Consolas"/>
+                <w:b w:val="false"/>
+                <w:bCs w:val="false"/>
+                <w:color w:val="4A6358"/>
+                <w:sz w:val="17"/>
+                <w:szCs w:val="17"/>
+              </w:rPr>
+              <w:t xml:space="preserve">BOOLEAN</w:t>
+            </w:r>
+          </w:p>
+        </w:tc>
+        <w:tc>
+          <w:tcPr>
+            <w:tcW w:type="dxa" w:w="5000"/>
+            <w:tcBorders>
+              <w:top w:val="single" w:color="C8E6D4" w:sz="4"/>
+              <w:left w:val="single" w:color="C8E6D4" w:sz="4"/>
+              <w:bottom w:val="single" w:color="C8E6D4" w:sz="4"/>
+              <w:right w:val="single" w:color="C8E6D4" w:sz="4"/>
+            </w:tcBorders>
+            <w:shd w:fill="FFFFFF" w:val="clear"/>
+            <w:tcMar>
+              <w:top w:type="dxa" w:w="80"/>
+              <w:left w:type="dxa" w:w="120"/>
+              <w:bottom w:type="dxa" w:w="80"/>
+              <w:right w:type="dxa" w:w="120"/>
+            </w:tcMar>
+            <w:vAlign w:val="center"/>
+          </w:tcPr>
+          <w:p>
+            <w:r>
+              <w:rPr>
+                <w:rFonts w:ascii="Arial" w:cs="Arial" w:eastAsia="Arial" w:hAnsi="Arial"/>
+                <w:b w:val="false"/>
+                <w:bCs w:val="false"/>
+                <w:color w:val="1A2E22"/>
+                <w:sz w:val="17"/>
+                <w:szCs w:val="17"/>
+              </w:rPr>
+              <w:t xml:space="preserve">Indica se o item já foi comprado — padrão false</w:t>
+            </w:r>
+          </w:p>
+        </w:tc>
+      </w:tr>
+      <w:tr>
+        <w:tc>
+          <w:tcPr>
+            <w:tcW w:type="dxa" w:w="1900"/>
+            <w:tcBorders>
+              <w:top w:val="single" w:color="C8E6D4" w:sz="4"/>
+              <w:left w:val="single" w:color="C8E6D4" w:sz="4"/>
+              <w:bottom w:val="single" w:color="C8E6D4" w:sz="4"/>
+              <w:right w:val="single" w:color="C8E6D4" w:sz="4"/>
+            </w:tcBorders>
+            <w:shd w:fill="F4FAF6" w:val="clear"/>
+            <w:tcMar>
+              <w:top w:type="dxa" w:w="80"/>
+              <w:left w:type="dxa" w:w="120"/>
+              <w:bottom w:type="dxa" w:w="80"/>
+              <w:right w:type="dxa" w:w="120"/>
+            </w:tcMar>
+            <w:vAlign w:val="center"/>
+          </w:tcPr>
+          <w:p>
+            <w:r>
+              <w:rPr>
+                <w:rFonts w:ascii="Consolas" w:cs="Consolas" w:eastAsia="Consolas" w:hAnsi="Consolas"/>
+                <w:b/>
+                <w:bCs/>
+                <w:color w:val="2D6A4F"/>
+                <w:sz w:val="17"/>
+                <w:szCs w:val="17"/>
+              </w:rPr>
+              <w:t xml:space="preserve">origem</w:t>
+            </w:r>
+          </w:p>
+        </w:tc>
+        <w:tc>
+          <w:tcPr>
+            <w:tcW w:type="dxa" w:w="1900"/>
+            <w:tcBorders>
+              <w:top w:val="single" w:color="C8E6D4" w:sz="4"/>
+              <w:left w:val="single" w:color="C8E6D4" w:sz="4"/>
+              <w:bottom w:val="single" w:color="C8E6D4" w:sz="4"/>
+              <w:right w:val="single" w:color="C8E6D4" w:sz="4"/>
+            </w:tcBorders>
+            <w:shd w:fill="F4FAF6" w:val="clear"/>
+            <w:tcMar>
+              <w:top w:type="dxa" w:w="80"/>
+              <w:left w:type="dxa" w:w="120"/>
+              <w:bottom w:type="dxa" w:w="80"/>
+              <w:right w:type="dxa" w:w="120"/>
+            </w:tcMar>
+            <w:vAlign w:val="center"/>
+          </w:tcPr>
+          <w:p>
+            <w:r>
+              <w:rPr>
+                <w:rFonts w:ascii="Consolas" w:cs="Consolas" w:eastAsia="Consolas" w:hAnsi="Consolas"/>
+                <w:b w:val="false"/>
+                <w:bCs w:val="false"/>
+                <w:color w:val="4A6358"/>
+                <w:sz w:val="17"/>
+                <w:szCs w:val="17"/>
+              </w:rPr>
+              <w:t xml:space="preserve">VARCHAR(20)</w:t>
+            </w:r>
+          </w:p>
+        </w:tc>
+        <w:tc>
+          <w:tcPr>
+            <w:tcW w:type="dxa" w:w="5000"/>
+            <w:tcBorders>
+              <w:top w:val="single" w:color="C8E6D4" w:sz="4"/>
+              <w:left w:val="single" w:color="C8E6D4" w:sz="4"/>
+              <w:bottom w:val="single" w:color="C8E6D4" w:sz="4"/>
+              <w:right w:val="single" w:color="C8E6D4" w:sz="4"/>
+            </w:tcBorders>
+            <w:shd w:fill="F4FAF6" w:val="clear"/>
+            <w:tcMar>
+              <w:top w:type="dxa" w:w="80"/>
+              <w:left w:type="dxa" w:w="120"/>
+              <w:bottom w:type="dxa" w:w="80"/>
+              <w:right w:type="dxa" w:w="120"/>
+            </w:tcMar>
+            <w:vAlign w:val="center"/>
+          </w:tcPr>
+          <w:p>
+            <w:r>
+              <w:rPr>
+                <w:rFonts w:ascii="Arial" w:cs="Arial" w:eastAsia="Arial" w:hAnsi="Arial"/>
+                <w:b w:val="false"/>
+                <w:bCs w:val="false"/>
+                <w:color w:val="1A2E22"/>
+                <w:sz w:val="17"/>
+                <w:szCs w:val="17"/>
+              </w:rPr>
+              <w:t xml:space="preserve">Como o item entrou na lista — restrição CHECK aceita apenas "manual" ou "sugestao"</w:t>
+            </w:r>
+          </w:p>
+        </w:tc>
+      </w:tr>
+      <w:tr>
+        <w:tc>
+          <w:tcPr>
+            <w:tcW w:type="dxa" w:w="1900"/>
+            <w:tcBorders>
+              <w:top w:val="single" w:color="C8E6D4" w:sz="4"/>
+              <w:left w:val="single" w:color="C8E6D4" w:sz="4"/>
+              <w:bottom w:val="single" w:color="C8E6D4" w:sz="4"/>
+              <w:right w:val="single" w:color="C8E6D4" w:sz="4"/>
+            </w:tcBorders>
+            <w:shd w:fill="FFFFFF" w:val="clear"/>
+            <w:tcMar>
+              <w:top w:type="dxa" w:w="80"/>
+              <w:left w:type="dxa" w:w="120"/>
+              <w:bottom w:type="dxa" w:w="80"/>
+              <w:right w:type="dxa" w:w="120"/>
+            </w:tcMar>
+            <w:vAlign w:val="center"/>
+          </w:tcPr>
+          <w:p>
+            <w:r>
+              <w:rPr>
+                <w:rFonts w:ascii="Consolas" w:cs="Consolas" w:eastAsia="Consolas" w:hAnsi="Consolas"/>
+                <w:b/>
+                <w:bCs/>
+                <w:color w:val="2D6A4F"/>
+                <w:sz w:val="17"/>
+                <w:szCs w:val="17"/>
+              </w:rPr>
+              <w:t xml:space="preserve">criado_em</w:t>
+            </w:r>
+          </w:p>
+        </w:tc>
+        <w:tc>
+          <w:tcPr>
+            <w:tcW w:type="dxa" w:w="1900"/>
+            <w:tcBorders>
+              <w:top w:val="single" w:color="C8E6D4" w:sz="4"/>
+              <w:left w:val="single" w:color="C8E6D4" w:sz="4"/>
+              <w:bottom w:val="single" w:color="C8E6D4" w:sz="4"/>
+              <w:right w:val="single" w:color="C8E6D4" w:sz="4"/>
+            </w:tcBorders>
+            <w:shd w:fill="FFFFFF" w:val="clear"/>
+            <w:tcMar>
+              <w:top w:type="dxa" w:w="80"/>
+              <w:left w:type="dxa" w:w="120"/>
+              <w:bottom w:type="dxa" w:w="80"/>
+              <w:right w:type="dxa" w:w="120"/>
+            </w:tcMar>
+            <w:vAlign w:val="center"/>
+          </w:tcPr>
+          <w:p>
+            <w:r>
+              <w:rPr>
+                <w:rFonts w:ascii="Consolas" w:cs="Consolas" w:eastAsia="Consolas" w:hAnsi="Consolas"/>
+                <w:b w:val="false"/>
+                <w:bCs w:val="false"/>
+                <w:color w:val="4A6358"/>
+                <w:sz w:val="17"/>
+                <w:szCs w:val="17"/>
+              </w:rPr>
+              <w:t xml:space="preserve">TIMESTAMP</w:t>
+            </w:r>
+          </w:p>
+        </w:tc>
+        <w:tc>
+          <w:tcPr>
+            <w:tcW w:type="dxa" w:w="5000"/>
+            <w:tcBorders>
+              <w:top w:val="single" w:color="C8E6D4" w:sz="4"/>
+              <w:left w:val="single" w:color="C8E6D4" w:sz="4"/>
+              <w:bottom w:val="single" w:color="C8E6D4" w:sz="4"/>
+              <w:right w:val="single" w:color="C8E6D4" w:sz="4"/>
+            </w:tcBorders>
+            <w:shd w:fill="FFFFFF" w:val="clear"/>
+            <w:tcMar>
+              <w:top w:type="dxa" w:w="80"/>
+              <w:left w:type="dxa" w:w="120"/>
+              <w:bottom w:type="dxa" w:w="80"/>
+              <w:right w:type="dxa" w:w="120"/>
+            </w:tcMar>
+            <w:vAlign w:val="center"/>
+          </w:tcPr>
+          <w:p>
+            <w:r>
+              <w:rPr>
+                <w:rFonts w:ascii="Arial" w:cs="Arial" w:eastAsia="Arial" w:hAnsi="Arial"/>
+                <w:b w:val="false"/>
+                <w:bCs w:val="false"/>
+                <w:color w:val="1A2E22"/>
+                <w:sz w:val="17"/>
+                <w:szCs w:val="17"/>
+              </w:rPr>
+              <w:t xml:space="preserve">Data e hora em que o item foi adicionado</w:t>
+            </w:r>
+          </w:p>
+        </w:tc>
+      </w:tr>
+    </w:tbl>
+    <w:p>
+      <w:pPr>
+        <w:spacing w:after="100" w:before="240"/>
+      </w:pPr>
+      <w:r>
+        <w:rPr>
+          <w:rFonts w:ascii="Arial" w:cs="Arial" w:eastAsia="Arial" w:hAnsi="Arial"/>
+          <w:b/>
+          <w:bCs/>
+          <w:color w:val="2D6A4F"/>
+          <w:sz w:val="22"/>
+          <w:szCs w:val="22"/>
+        </w:rPr>
+        <w:t xml:space="preserve">3.5  Relacionamento: CLASSIFICA</w:t>
       </w:r>
     </w:p>
     <w:p>
@@ -2110,6 +4320,168 @@
     </w:p>
     <w:p>
       <w:pPr>
+        <w:spacing w:after="100" w:before="240"/>
+      </w:pPr>
+      <w:r>
+        <w:rPr>
+          <w:rFonts w:ascii="Arial" w:cs="Arial" w:eastAsia="Arial" w:hAnsi="Arial"/>
+          <w:b/>
+          <w:bCs/>
+          <w:color w:val="2D6A4F"/>
+          <w:sz w:val="22"/>
+          <w:szCs w:val="22"/>
+        </w:rPr>
+        <w:t xml:space="preserve">3.6  Relacionamento: histórico de saída</w:t>
+      </w:r>
+    </w:p>
+    <w:p>
+      <w:pPr>
+        <w:spacing w:after="80" w:line="300"/>
+        <w:ind w:left="400" w:hanging="200"/>
+      </w:pPr>
+      <w:r>
+        <w:rPr>
+          <w:rFonts w:ascii="Arial" w:cs="Arial" w:eastAsia="Arial" w:hAnsi="Arial"/>
+          <w:b/>
+          <w:bCs/>
+          <w:color w:val="2D6A4F"/>
+          <w:sz w:val="20"/>
+          <w:szCs w:val="20"/>
+        </w:rPr>
+        <w:t xml:space="preserve">•   </w:t>
+      </w:r>
+      <w:r>
+        <w:rPr>
+          <w:rFonts w:ascii="Arial" w:cs="Arial" w:eastAsia="Arial" w:hAnsi="Arial"/>
+          <w:color w:val="1A2E22"/>
+          <w:sz w:val="20"/>
+          <w:szCs w:val="20"/>
+        </w:rPr>
+        <w:t xml:space="preserve">Cardinalidade: cada saída de um ALIMENTO (consumido ou descartado) gera exatamente um registro em HISTORICO_ALIMENTOS — ao longo do tempo, um mesmo nome de alimento pode gerar muitos registros.</w:t>
+      </w:r>
+    </w:p>
+    <w:p>
+      <w:pPr>
+        <w:spacing w:after="80" w:line="300"/>
+        <w:ind w:left="400" w:hanging="200"/>
+      </w:pPr>
+      <w:r>
+        <w:rPr>
+          <w:rFonts w:ascii="Arial" w:cs="Arial" w:eastAsia="Arial" w:hAnsi="Arial"/>
+          <w:b/>
+          <w:bCs/>
+          <w:color w:val="2D6A4F"/>
+          <w:sz w:val="20"/>
+          <w:szCs w:val="20"/>
+        </w:rPr>
+        <w:t xml:space="preserve">•   </w:t>
+      </w:r>
+      <w:r>
+        <w:rPr>
+          <w:rFonts w:ascii="Arial" w:cs="Arial" w:eastAsia="Arial" w:hAnsi="Arial"/>
+          <w:color w:val="1A2E22"/>
+          <w:sz w:val="20"/>
+          <w:szCs w:val="20"/>
+        </w:rPr>
+        <w:t xml:space="preserve">Particularidade de modelagem: alimento_id não é implementado como chave estrangeira formal, porque a linha referenciada em ALIMENTOS é excluída no mesmo instante em que o histórico é gravado — uma FK exigiria que a linha continuasse existindo. Em vez disso, HISTORICO_ALIMENTOS guarda uma cópia dos dados relevantes (nome, categoria_nome, quantidade, unidade etc.) no momento da saída.</w:t>
+      </w:r>
+    </w:p>
+    <w:p>
+      <w:pPr>
+        <w:spacing w:after="80" w:line="300"/>
+        <w:ind w:left="400" w:hanging="200"/>
+      </w:pPr>
+      <w:r>
+        <w:rPr>
+          <w:rFonts w:ascii="Arial" w:cs="Arial" w:eastAsia="Arial" w:hAnsi="Arial"/>
+          <w:b/>
+          <w:bCs/>
+          <w:color w:val="2D6A4F"/>
+          <w:sz w:val="20"/>
+          <w:szCs w:val="20"/>
+        </w:rPr>
+        <w:t xml:space="preserve">•   </w:t>
+      </w:r>
+      <w:r>
+        <w:rPr>
+          <w:rFonts w:ascii="Arial" w:cs="Arial" w:eastAsia="Arial" w:hAnsi="Arial"/>
+          <w:color w:val="1A2E22"/>
+          <w:sz w:val="20"/>
+          <w:szCs w:val="20"/>
+        </w:rPr>
+        <w:t xml:space="preserve">Implementação: transação única no endpoint DELETE /alimentos/:id — BEGIN, INSERT em HISTORICO_ALIMENTOS, DELETE em ALIMENTOS, COMMIT — com ROLLBACK automático se qualquer etapa falhar.</w:t>
+      </w:r>
+    </w:p>
+    <w:p>
+      <w:pPr>
+        <w:spacing w:after="100" w:before="240"/>
+      </w:pPr>
+      <w:r>
+        <w:rPr>
+          <w:rFonts w:ascii="Arial" w:cs="Arial" w:eastAsia="Arial" w:hAnsi="Arial"/>
+          <w:b/>
+          <w:bCs/>
+          <w:color w:val="2D6A4F"/>
+          <w:sz w:val="22"/>
+          <w:szCs w:val="22"/>
+        </w:rPr>
+        <w:t xml:space="preserve">3.7  LISTA_COMPRAS: entidade independente</w:t>
+      </w:r>
+    </w:p>
+    <w:p>
+      <w:pPr>
+        <w:spacing w:after="80" w:line="300"/>
+        <w:ind w:left="400" w:hanging="200"/>
+      </w:pPr>
+      <w:r>
+        <w:rPr>
+          <w:rFonts w:ascii="Arial" w:cs="Arial" w:eastAsia="Arial" w:hAnsi="Arial"/>
+          <w:b/>
+          <w:bCs/>
+          <w:color w:val="2D6A4F"/>
+          <w:sz w:val="20"/>
+          <w:szCs w:val="20"/>
+        </w:rPr>
+        <w:t xml:space="preserve">•   </w:t>
+      </w:r>
+      <w:r>
+        <w:rPr>
+          <w:rFonts w:ascii="Arial" w:cs="Arial" w:eastAsia="Arial" w:hAnsi="Arial"/>
+          <w:color w:val="1A2E22"/>
+          <w:sz w:val="20"/>
+          <w:szCs w:val="20"/>
+        </w:rPr>
+        <w:t xml:space="preserve">LISTA_COMPRAS não possui chave estrangeira com ALIMENTOS nem CATEGORIAS: os itens são identificados só pelo nome (texto livre), porque um item da lista pode nem existir ainda no estoque — é justamente o que está fazendo falta.</w:t>
+      </w:r>
+    </w:p>
+    <w:p>
+      <w:pPr>
+        <w:spacing w:after="80" w:line="300"/>
+        <w:ind w:left="400" w:hanging="200"/>
+      </w:pPr>
+      <w:r>
+        <w:rPr>
+          <w:rFonts w:ascii="Arial" w:cs="Arial" w:eastAsia="Arial" w:hAnsi="Arial"/>
+          <w:b/>
+          <w:bCs/>
+          <w:color w:val="2D6A4F"/>
+          <w:sz w:val="20"/>
+          <w:szCs w:val="20"/>
+        </w:rPr>
+        <w:t xml:space="preserve">•   </w:t>
+      </w:r>
+      <w:r>
+        <w:rPr>
+          <w:rFonts w:ascii="Arial" w:cs="Arial" w:eastAsia="Arial" w:hAnsi="Arial"/>
+          <w:color w:val="1A2E22"/>
+          <w:sz w:val="20"/>
+          <w:szCs w:val="20"/>
+        </w:rPr>
+        <w:t xml:space="preserve">A ligação com o histórico de consumo é feita em tempo de leitura pela view vw_sugestao_compras (seção 6.4), que cruza LISTA_COMPRAS com HISTORICO_ALIMENTOS e ALIMENTOS sem exigir uma FK persistida.</w:t>
+      </w:r>
+    </w:p>
+    <w:p>
+      <w:pPr>
         <w:pBdr>
           <w:left w:val="single" w:color="2D6A4F" w:sz="18"/>
         </w:pBdr>
@@ -2125,7 +4497,7 @@
           <w:sz w:val="26"/>
           <w:szCs w:val="26"/>
         </w:rPr>
-        <w:t xml:space="preserve">4.  Diagrama Entidade-Relacionamento (DER)</w:t>
+        <w:t xml:space="preserve">5.  Diagrama Entidade-Relacionamento (DER)</w:t>
       </w:r>
     </w:p>
     <w:p>
@@ -2525,6 +4897,501 @@
           <w:szCs w:val="18"/>
         </w:rPr>
         <w:t xml:space="preserve">   │       atualizado_em      TIMESTAMP │</w:t>
+      </w:r>
+    </w:p>
+    <w:p>
+      <w:pPr>
+        <w:shd w:fill="F4FAF6" w:val="clear"/>
+        <w:spacing w:after="0" w:before="0"/>
+        <w:ind w:left="200"/>
+      </w:pPr>
+      <w:r>
+        <w:rPr>
+          <w:rFonts w:ascii="Consolas" w:cs="Consolas" w:eastAsia="Consolas" w:hAnsi="Consolas"/>
+          <w:color w:val="1A3A2A"/>
+          <w:sz w:val="18"/>
+          <w:szCs w:val="18"/>
+        </w:rPr>
+        <w:t xml:space="preserve">   └─────────────────┬──────────────────┘</w:t>
+      </w:r>
+    </w:p>
+    <w:p>
+      <w:pPr>
+        <w:shd w:fill="F4FAF6" w:val="clear"/>
+        <w:spacing w:after="0" w:before="0"/>
+        <w:ind w:left="200"/>
+      </w:pPr>
+      <w:r>
+        <w:rPr>
+          <w:rFonts w:ascii="Consolas" w:cs="Consolas" w:eastAsia="Consolas" w:hAnsi="Consolas"/>
+          <w:color w:val="1A3A2A"/>
+          <w:sz w:val="18"/>
+          <w:szCs w:val="18"/>
+        </w:rPr>
+        <w:t xml:space="preserve">                     ┆</w:t>
+      </w:r>
+    </w:p>
+    <w:p>
+      <w:pPr>
+        <w:shd w:fill="F4FAF6" w:val="clear"/>
+        <w:spacing w:after="0" w:before="0"/>
+        <w:ind w:left="200"/>
+      </w:pPr>
+      <w:r>
+        <w:rPr>
+          <w:rFonts w:ascii="Consolas" w:cs="Consolas" w:eastAsia="Consolas" w:hAnsi="Consolas"/>
+          <w:color w:val="1A3A2A"/>
+          <w:sz w:val="18"/>
+          <w:szCs w:val="18"/>
+        </w:rPr>
+        <w:t xml:space="preserve">                     ┆   grava saída (sem FK)</w:t>
+      </w:r>
+    </w:p>
+    <w:p>
+      <w:pPr>
+        <w:shd w:fill="F4FAF6" w:val="clear"/>
+        <w:spacing w:after="0" w:before="0"/>
+        <w:ind w:left="200"/>
+      </w:pPr>
+      <w:r>
+        <w:rPr>
+          <w:rFonts w:ascii="Consolas" w:cs="Consolas" w:eastAsia="Consolas" w:hAnsi="Consolas"/>
+          <w:color w:val="1A3A2A"/>
+          <w:sz w:val="18"/>
+          <w:szCs w:val="18"/>
+        </w:rPr>
+        <w:t xml:space="preserve">                    /|\</w:t>
+      </w:r>
+    </w:p>
+    <w:p>
+      <w:pPr>
+        <w:shd w:fill="F4FAF6" w:val="clear"/>
+        <w:spacing w:after="0" w:before="0"/>
+        <w:ind w:left="200"/>
+      </w:pPr>
+      <w:r>
+        <w:rPr>
+          <w:rFonts w:ascii="Consolas" w:cs="Consolas" w:eastAsia="Consolas" w:hAnsi="Consolas"/>
+          <w:color w:val="1A3A2A"/>
+          <w:sz w:val="18"/>
+          <w:szCs w:val="18"/>
+        </w:rPr>
+        <w:t xml:space="preserve">   ┌────────────────────────────────────┐</w:t>
+      </w:r>
+    </w:p>
+    <w:p>
+      <w:pPr>
+        <w:shd w:fill="F4FAF6" w:val="clear"/>
+        <w:spacing w:after="0" w:before="0"/>
+        <w:ind w:left="200"/>
+      </w:pPr>
+      <w:r>
+        <w:rPr>
+          <w:rFonts w:ascii="Consolas" w:cs="Consolas" w:eastAsia="Consolas" w:hAnsi="Consolas"/>
+          <w:color w:val="1A3A2A"/>
+          <w:sz w:val="18"/>
+          <w:szCs w:val="18"/>
+        </w:rPr>
+        <w:t xml:space="preserve">   │        HISTORICO_ALIMENTOS         │</w:t>
+      </w:r>
+    </w:p>
+    <w:p>
+      <w:pPr>
+        <w:shd w:fill="F4FAF6" w:val="clear"/>
+        <w:spacing w:after="0" w:before="0"/>
+        <w:ind w:left="200"/>
+      </w:pPr>
+      <w:r>
+        <w:rPr>
+          <w:rFonts w:ascii="Consolas" w:cs="Consolas" w:eastAsia="Consolas" w:hAnsi="Consolas"/>
+          <w:color w:val="1A3A2A"/>
+          <w:sz w:val="18"/>
+          <w:szCs w:val="18"/>
+        </w:rPr>
+        <w:t xml:space="preserve">   ├────────────────────────────────────┤</w:t>
+      </w:r>
+    </w:p>
+    <w:p>
+      <w:pPr>
+        <w:shd w:fill="F4FAF6" w:val="clear"/>
+        <w:spacing w:after="0" w:before="0"/>
+        <w:ind w:left="200"/>
+      </w:pPr>
+      <w:r>
+        <w:rPr>
+          <w:rFonts w:ascii="Consolas" w:cs="Consolas" w:eastAsia="Consolas" w:hAnsi="Consolas"/>
+          <w:color w:val="1A3A2A"/>
+          <w:sz w:val="18"/>
+          <w:szCs w:val="18"/>
+        </w:rPr>
+        <w:t xml:space="preserve">   │  PK   id                 SERIAL    │</w:t>
+      </w:r>
+    </w:p>
+    <w:p>
+      <w:pPr>
+        <w:shd w:fill="F4FAF6" w:val="clear"/>
+        <w:spacing w:after="0" w:before="0"/>
+        <w:ind w:left="200"/>
+      </w:pPr>
+      <w:r>
+        <w:rPr>
+          <w:rFonts w:ascii="Consolas" w:cs="Consolas" w:eastAsia="Consolas" w:hAnsi="Consolas"/>
+          <w:color w:val="1A3A2A"/>
+          <w:sz w:val="18"/>
+          <w:szCs w:val="18"/>
+        </w:rPr>
+        <w:t xml:space="preserve">   │       alimento_id        INTEGER   │</w:t>
+      </w:r>
+    </w:p>
+    <w:p>
+      <w:pPr>
+        <w:shd w:fill="F4FAF6" w:val="clear"/>
+        <w:spacing w:after="0" w:before="0"/>
+        <w:ind w:left="200"/>
+      </w:pPr>
+      <w:r>
+        <w:rPr>
+          <w:rFonts w:ascii="Consolas" w:cs="Consolas" w:eastAsia="Consolas" w:hAnsi="Consolas"/>
+          <w:color w:val="1A3A2A"/>
+          <w:sz w:val="18"/>
+          <w:szCs w:val="18"/>
+        </w:rPr>
+        <w:t xml:space="preserve">   │       nome               VARCHAR   │</w:t>
+      </w:r>
+    </w:p>
+    <w:p>
+      <w:pPr>
+        <w:shd w:fill="F4FAF6" w:val="clear"/>
+        <w:spacing w:after="0" w:before="0"/>
+        <w:ind w:left="200"/>
+      </w:pPr>
+      <w:r>
+        <w:rPr>
+          <w:rFonts w:ascii="Consolas" w:cs="Consolas" w:eastAsia="Consolas" w:hAnsi="Consolas"/>
+          <w:color w:val="1A3A2A"/>
+          <w:sz w:val="18"/>
+          <w:szCs w:val="18"/>
+        </w:rPr>
+        <w:t xml:space="preserve">   │  FK   categoria_id       INTEGER   │</w:t>
+      </w:r>
+    </w:p>
+    <w:p>
+      <w:pPr>
+        <w:shd w:fill="F4FAF6" w:val="clear"/>
+        <w:spacing w:after="0" w:before="0"/>
+        <w:ind w:left="200"/>
+      </w:pPr>
+      <w:r>
+        <w:rPr>
+          <w:rFonts w:ascii="Consolas" w:cs="Consolas" w:eastAsia="Consolas" w:hAnsi="Consolas"/>
+          <w:color w:val="1A3A2A"/>
+          <w:sz w:val="18"/>
+          <w:szCs w:val="18"/>
+        </w:rPr>
+        <w:t xml:space="preserve">   │       categoria_nome     VARCHAR   │</w:t>
+      </w:r>
+    </w:p>
+    <w:p>
+      <w:pPr>
+        <w:shd w:fill="F4FAF6" w:val="clear"/>
+        <w:spacing w:after="0" w:before="0"/>
+        <w:ind w:left="200"/>
+      </w:pPr>
+      <w:r>
+        <w:rPr>
+          <w:rFonts w:ascii="Consolas" w:cs="Consolas" w:eastAsia="Consolas" w:hAnsi="Consolas"/>
+          <w:color w:val="1A3A2A"/>
+          <w:sz w:val="18"/>
+          <w:szCs w:val="18"/>
+        </w:rPr>
+        <w:t xml:space="preserve">   │       quantidade         DECIMAL   │</w:t>
+      </w:r>
+    </w:p>
+    <w:p>
+      <w:pPr>
+        <w:shd w:fill="F4FAF6" w:val="clear"/>
+        <w:spacing w:after="0" w:before="0"/>
+        <w:ind w:left="200"/>
+      </w:pPr>
+      <w:r>
+        <w:rPr>
+          <w:rFonts w:ascii="Consolas" w:cs="Consolas" w:eastAsia="Consolas" w:hAnsi="Consolas"/>
+          <w:color w:val="1A3A2A"/>
+          <w:sz w:val="18"/>
+          <w:szCs w:val="18"/>
+        </w:rPr>
+        <w:t xml:space="preserve">   │       unidade            VARCHAR   │</w:t>
+      </w:r>
+    </w:p>
+    <w:p>
+      <w:pPr>
+        <w:shd w:fill="F4FAF6" w:val="clear"/>
+        <w:spacing w:after="0" w:before="0"/>
+        <w:ind w:left="200"/>
+      </w:pPr>
+      <w:r>
+        <w:rPr>
+          <w:rFonts w:ascii="Consolas" w:cs="Consolas" w:eastAsia="Consolas" w:hAnsi="Consolas"/>
+          <w:color w:val="1A3A2A"/>
+          <w:sz w:val="18"/>
+          <w:szCs w:val="18"/>
+        </w:rPr>
+        <w:t xml:space="preserve">   │       data_validade      DATE      │</w:t>
+      </w:r>
+    </w:p>
+    <w:p>
+      <w:pPr>
+        <w:shd w:fill="F4FAF6" w:val="clear"/>
+        <w:spacing w:after="0" w:before="0"/>
+        <w:ind w:left="200"/>
+      </w:pPr>
+      <w:r>
+        <w:rPr>
+          <w:rFonts w:ascii="Consolas" w:cs="Consolas" w:eastAsia="Consolas" w:hAnsi="Consolas"/>
+          <w:color w:val="1A3A2A"/>
+          <w:sz w:val="18"/>
+          <w:szCs w:val="18"/>
+        </w:rPr>
+        <w:t xml:space="preserve">   │       local_armazenam.   VARCHAR   │</w:t>
+      </w:r>
+    </w:p>
+    <w:p>
+      <w:pPr>
+        <w:shd w:fill="F4FAF6" w:val="clear"/>
+        <w:spacing w:after="0" w:before="0"/>
+        <w:ind w:left="200"/>
+      </w:pPr>
+      <w:r>
+        <w:rPr>
+          <w:rFonts w:ascii="Consolas" w:cs="Consolas" w:eastAsia="Consolas" w:hAnsi="Consolas"/>
+          <w:color w:val="1A3A2A"/>
+          <w:sz w:val="18"/>
+          <w:szCs w:val="18"/>
+        </w:rPr>
+        <w:t xml:space="preserve">   │       status_saida       VARCHAR   │</w:t>
+      </w:r>
+    </w:p>
+    <w:p>
+      <w:pPr>
+        <w:shd w:fill="F4FAF6" w:val="clear"/>
+        <w:spacing w:after="0" w:before="0"/>
+        <w:ind w:left="200"/>
+      </w:pPr>
+      <w:r>
+        <w:rPr>
+          <w:rFonts w:ascii="Consolas" w:cs="Consolas" w:eastAsia="Consolas" w:hAnsi="Consolas"/>
+          <w:color w:val="1A3A2A"/>
+          <w:sz w:val="18"/>
+          <w:szCs w:val="18"/>
+        </w:rPr>
+        <w:t xml:space="preserve">   │       data_saida         TIMESTAMP │</w:t>
+      </w:r>
+    </w:p>
+    <w:p>
+      <w:pPr>
+        <w:shd w:fill="F4FAF6" w:val="clear"/>
+        <w:spacing w:after="0" w:before="0"/>
+        <w:ind w:left="200"/>
+      </w:pPr>
+      <w:r>
+        <w:rPr>
+          <w:rFonts w:ascii="Consolas" w:cs="Consolas" w:eastAsia="Consolas" w:hAnsi="Consolas"/>
+          <w:color w:val="1A3A2A"/>
+          <w:sz w:val="18"/>
+          <w:szCs w:val="18"/>
+        </w:rPr>
+        <w:t xml:space="preserve">   │       criado_em          TIMESTAMP │</w:t>
+      </w:r>
+    </w:p>
+    <w:p>
+      <w:pPr>
+        <w:shd w:fill="F4FAF6" w:val="clear"/>
+        <w:spacing w:after="0" w:before="0"/>
+        <w:ind w:left="200"/>
+      </w:pPr>
+      <w:r>
+        <w:rPr>
+          <w:rFonts w:ascii="Consolas" w:cs="Consolas" w:eastAsia="Consolas" w:hAnsi="Consolas"/>
+          <w:color w:val="1A3A2A"/>
+          <w:sz w:val="18"/>
+          <w:szCs w:val="18"/>
+        </w:rPr>
+        <w:t xml:space="preserve">   └────────────────────────────────────┘</w:t>
+      </w:r>
+    </w:p>
+    <w:p>
+      <w:pPr>
+        <w:spacing w:after="100" w:line="300"/>
+        <w:jc w:val="both"/>
+      </w:pPr>
+      <w:r>
+        <w:rPr>
+          <w:rFonts w:ascii="Arial" w:cs="Arial" w:eastAsia="Arial" w:hAnsi="Arial"/>
+          <w:color w:val="1A2E22"/>
+          <w:sz w:val="20"/>
+          <w:szCs w:val="20"/>
+        </w:rPr>
+        <w:t xml:space="preserve">LISTA_COMPRAS não tem relação formal com as demais entidades (seção 3.7) — por isso é representada isolada, sem linha de conexão:</w:t>
+      </w:r>
+    </w:p>
+    <w:p>
+      <w:pPr>
+        <w:shd w:fill="F4FAF6" w:val="clear"/>
+        <w:spacing w:after="0" w:before="80"/>
+        <w:ind w:left="200"/>
+      </w:pPr>
+      <w:r>
+        <w:rPr>
+          <w:rFonts w:ascii="Consolas" w:cs="Consolas" w:eastAsia="Consolas" w:hAnsi="Consolas"/>
+          <w:color w:val="1A3A2A"/>
+          <w:sz w:val="18"/>
+          <w:szCs w:val="18"/>
+        </w:rPr>
+        <w:t xml:space="preserve">   ┌────────────────────────────────────┐</w:t>
+      </w:r>
+    </w:p>
+    <w:p>
+      <w:pPr>
+        <w:shd w:fill="F4FAF6" w:val="clear"/>
+        <w:spacing w:after="0" w:before="0"/>
+        <w:ind w:left="200"/>
+      </w:pPr>
+      <w:r>
+        <w:rPr>
+          <w:rFonts w:ascii="Consolas" w:cs="Consolas" w:eastAsia="Consolas" w:hAnsi="Consolas"/>
+          <w:color w:val="1A3A2A"/>
+          <w:sz w:val="18"/>
+          <w:szCs w:val="18"/>
+        </w:rPr>
+        <w:t xml:space="preserve">   │           LISTA_COMPRAS            │</w:t>
+      </w:r>
+    </w:p>
+    <w:p>
+      <w:pPr>
+        <w:shd w:fill="F4FAF6" w:val="clear"/>
+        <w:spacing w:after="0" w:before="0"/>
+        <w:ind w:left="200"/>
+      </w:pPr>
+      <w:r>
+        <w:rPr>
+          <w:rFonts w:ascii="Consolas" w:cs="Consolas" w:eastAsia="Consolas" w:hAnsi="Consolas"/>
+          <w:color w:val="1A3A2A"/>
+          <w:sz w:val="18"/>
+          <w:szCs w:val="18"/>
+        </w:rPr>
+        <w:t xml:space="preserve">   ├────────────────────────────────────┤</w:t>
+      </w:r>
+    </w:p>
+    <w:p>
+      <w:pPr>
+        <w:shd w:fill="F4FAF6" w:val="clear"/>
+        <w:spacing w:after="0" w:before="0"/>
+        <w:ind w:left="200"/>
+      </w:pPr>
+      <w:r>
+        <w:rPr>
+          <w:rFonts w:ascii="Consolas" w:cs="Consolas" w:eastAsia="Consolas" w:hAnsi="Consolas"/>
+          <w:color w:val="1A3A2A"/>
+          <w:sz w:val="18"/>
+          <w:szCs w:val="18"/>
+        </w:rPr>
+        <w:t xml:space="preserve">   │  PK   id                 SERIAL    │</w:t>
+      </w:r>
+    </w:p>
+    <w:p>
+      <w:pPr>
+        <w:shd w:fill="F4FAF6" w:val="clear"/>
+        <w:spacing w:after="0" w:before="0"/>
+        <w:ind w:left="200"/>
+      </w:pPr>
+      <w:r>
+        <w:rPr>
+          <w:rFonts w:ascii="Consolas" w:cs="Consolas" w:eastAsia="Consolas" w:hAnsi="Consolas"/>
+          <w:color w:val="1A3A2A"/>
+          <w:sz w:val="18"/>
+          <w:szCs w:val="18"/>
+        </w:rPr>
+        <w:t xml:space="preserve">   │       nome               VARCHAR   │</w:t>
+      </w:r>
+    </w:p>
+    <w:p>
+      <w:pPr>
+        <w:shd w:fill="F4FAF6" w:val="clear"/>
+        <w:spacing w:after="0" w:before="0"/>
+        <w:ind w:left="200"/>
+      </w:pPr>
+      <w:r>
+        <w:rPr>
+          <w:rFonts w:ascii="Consolas" w:cs="Consolas" w:eastAsia="Consolas" w:hAnsi="Consolas"/>
+          <w:color w:val="1A3A2A"/>
+          <w:sz w:val="18"/>
+          <w:szCs w:val="18"/>
+        </w:rPr>
+        <w:t xml:space="preserve">   │       quantidade         DECIMAL   │</w:t>
+      </w:r>
+    </w:p>
+    <w:p>
+      <w:pPr>
+        <w:shd w:fill="F4FAF6" w:val="clear"/>
+        <w:spacing w:after="0" w:before="0"/>
+        <w:ind w:left="200"/>
+      </w:pPr>
+      <w:r>
+        <w:rPr>
+          <w:rFonts w:ascii="Consolas" w:cs="Consolas" w:eastAsia="Consolas" w:hAnsi="Consolas"/>
+          <w:color w:val="1A3A2A"/>
+          <w:sz w:val="18"/>
+          <w:szCs w:val="18"/>
+        </w:rPr>
+        <w:t xml:space="preserve">   │       unidade            VARCHAR   │</w:t>
+      </w:r>
+    </w:p>
+    <w:p>
+      <w:pPr>
+        <w:shd w:fill="F4FAF6" w:val="clear"/>
+        <w:spacing w:after="0" w:before="0"/>
+        <w:ind w:left="200"/>
+      </w:pPr>
+      <w:r>
+        <w:rPr>
+          <w:rFonts w:ascii="Consolas" w:cs="Consolas" w:eastAsia="Consolas" w:hAnsi="Consolas"/>
+          <w:color w:val="1A3A2A"/>
+          <w:sz w:val="18"/>
+          <w:szCs w:val="18"/>
+        </w:rPr>
+        <w:t xml:space="preserve">   │       comprado           BOOLEAN   │</w:t>
+      </w:r>
+    </w:p>
+    <w:p>
+      <w:pPr>
+        <w:shd w:fill="F4FAF6" w:val="clear"/>
+        <w:spacing w:after="0" w:before="0"/>
+        <w:ind w:left="200"/>
+      </w:pPr>
+      <w:r>
+        <w:rPr>
+          <w:rFonts w:ascii="Consolas" w:cs="Consolas" w:eastAsia="Consolas" w:hAnsi="Consolas"/>
+          <w:color w:val="1A3A2A"/>
+          <w:sz w:val="18"/>
+          <w:szCs w:val="18"/>
+        </w:rPr>
+        <w:t xml:space="preserve">   │       origem             VARCHAR   │</w:t>
+      </w:r>
+    </w:p>
+    <w:p>
+      <w:pPr>
+        <w:shd w:fill="F4FAF6" w:val="clear"/>
+        <w:spacing w:after="0" w:before="0"/>
+        <w:ind w:left="200"/>
+      </w:pPr>
+      <w:r>
+        <w:rPr>
+          <w:rFonts w:ascii="Consolas" w:cs="Consolas" w:eastAsia="Consolas" w:hAnsi="Consolas"/>
+          <w:color w:val="1A3A2A"/>
+          <w:sz w:val="18"/>
+          <w:szCs w:val="18"/>
+        </w:rPr>
+        <w:t xml:space="preserve">   │       criado_em          TIMESTAMP │</w:t>
       </w:r>
     </w:p>
     <w:p>
@@ -2560,7 +5427,7 @@
           <w:sz w:val="26"/>
           <w:szCs w:val="26"/>
         </w:rPr>
-        <w:t xml:space="preserve">5.  Script de Criação (DDL)</w:t>
+        <w:t xml:space="preserve">6.  Script de Criação (DDL)</w:t>
       </w:r>
     </w:p>
     <w:p>
@@ -3205,6 +6072,806 @@
     <w:p>
       <w:pPr>
         <w:shd w:fill="F4FAF6" w:val="clear"/>
+        <w:spacing w:after="0" w:before="0"/>
+        <w:ind w:left="200"/>
+      </w:pPr>
+      <w:r>
+        <w:rPr>
+          <w:rFonts w:ascii="Consolas" w:cs="Consolas" w:eastAsia="Consolas" w:hAnsi="Consolas"/>
+          <w:color w:val="1A3A2A"/>
+          <w:sz w:val="18"/>
+          <w:szCs w:val="18"/>
+        </w:rPr>
+        <w:t xml:space="preserve">    ON alimentos (data_validade);</w:t>
+      </w:r>
+    </w:p>
+    <w:p>
+      <w:pPr>
+        <w:shd w:fill="F4FAF6" w:val="clear"/>
+        <w:spacing w:after="0" w:before="0"/>
+        <w:ind w:left="200"/>
+      </w:pPr>
+      <w:r>
+        <w:rPr>
+          <w:rFonts w:ascii="Consolas" w:cs="Consolas" w:eastAsia="Consolas" w:hAnsi="Consolas"/>
+          <w:color w:val="1A3A2A"/>
+          <w:sz w:val="18"/>
+          <w:szCs w:val="18"/>
+        </w:rPr>
+        <w:t xml:space="preserve"> </w:t>
+      </w:r>
+    </w:p>
+    <w:p>
+      <w:pPr>
+        <w:shd w:fill="F4FAF6" w:val="clear"/>
+        <w:spacing w:after="0" w:before="0"/>
+        <w:ind w:left="200"/>
+      </w:pPr>
+      <w:r>
+        <w:rPr>
+          <w:rFonts w:ascii="Consolas" w:cs="Consolas" w:eastAsia="Consolas" w:hAnsi="Consolas"/>
+          <w:color w:val="1A3A2A"/>
+          <w:sz w:val="18"/>
+          <w:szCs w:val="18"/>
+        </w:rPr>
+        <w:t xml:space="preserve">-- HISTÓRICO_ALIMENTOS (US-12/US-13) — registro das saídas da despensa</w:t>
+      </w:r>
+    </w:p>
+    <w:p>
+      <w:pPr>
+        <w:shd w:fill="F4FAF6" w:val="clear"/>
+        <w:spacing w:after="0" w:before="0"/>
+        <w:ind w:left="200"/>
+      </w:pPr>
+      <w:r>
+        <w:rPr>
+          <w:rFonts w:ascii="Consolas" w:cs="Consolas" w:eastAsia="Consolas" w:hAnsi="Consolas"/>
+          <w:color w:val="1A3A2A"/>
+          <w:sz w:val="18"/>
+          <w:szCs w:val="18"/>
+        </w:rPr>
+        <w:t xml:space="preserve">CREATE TABLE historico_alimentos (</w:t>
+      </w:r>
+    </w:p>
+    <w:p>
+      <w:pPr>
+        <w:shd w:fill="F4FAF6" w:val="clear"/>
+        <w:spacing w:after="0" w:before="0"/>
+        <w:ind w:left="200"/>
+      </w:pPr>
+      <w:r>
+        <w:rPr>
+          <w:rFonts w:ascii="Consolas" w:cs="Consolas" w:eastAsia="Consolas" w:hAnsi="Consolas"/>
+          <w:color w:val="1A3A2A"/>
+          <w:sz w:val="18"/>
+          <w:szCs w:val="18"/>
+        </w:rPr>
+        <w:t xml:space="preserve">    id                   SERIAL PRIMARY KEY,</w:t>
+      </w:r>
+    </w:p>
+    <w:p>
+      <w:pPr>
+        <w:shd w:fill="F4FAF6" w:val="clear"/>
+        <w:spacing w:after="0" w:before="0"/>
+        <w:ind w:left="200"/>
+      </w:pPr>
+      <w:r>
+        <w:rPr>
+          <w:rFonts w:ascii="Consolas" w:cs="Consolas" w:eastAsia="Consolas" w:hAnsi="Consolas"/>
+          <w:color w:val="1A3A2A"/>
+          <w:sz w:val="18"/>
+          <w:szCs w:val="18"/>
+        </w:rPr>
+        <w:t xml:space="preserve">    alimento_id          INTEGER,</w:t>
+      </w:r>
+    </w:p>
+    <w:p>
+      <w:pPr>
+        <w:shd w:fill="F4FAF6" w:val="clear"/>
+        <w:spacing w:after="0" w:before="0"/>
+        <w:ind w:left="200"/>
+      </w:pPr>
+      <w:r>
+        <w:rPr>
+          <w:rFonts w:ascii="Consolas" w:cs="Consolas" w:eastAsia="Consolas" w:hAnsi="Consolas"/>
+          <w:color w:val="1A3A2A"/>
+          <w:sz w:val="18"/>
+          <w:szCs w:val="18"/>
+        </w:rPr>
+        <w:t xml:space="preserve">    nome                 VARCHAR(100) NOT NULL,</w:t>
+      </w:r>
+    </w:p>
+    <w:p>
+      <w:pPr>
+        <w:shd w:fill="F4FAF6" w:val="clear"/>
+        <w:spacing w:after="0" w:before="0"/>
+        <w:ind w:left="200"/>
+      </w:pPr>
+      <w:r>
+        <w:rPr>
+          <w:rFonts w:ascii="Consolas" w:cs="Consolas" w:eastAsia="Consolas" w:hAnsi="Consolas"/>
+          <w:color w:val="1A3A2A"/>
+          <w:sz w:val="18"/>
+          <w:szCs w:val="18"/>
+        </w:rPr>
+        <w:t xml:space="preserve">    categoria_id         INTEGER REFERENCES categorias(id) ON DELETE SET NULL,</w:t>
+      </w:r>
+    </w:p>
+    <w:p>
+      <w:pPr>
+        <w:shd w:fill="F4FAF6" w:val="clear"/>
+        <w:spacing w:after="0" w:before="0"/>
+        <w:ind w:left="200"/>
+      </w:pPr>
+      <w:r>
+        <w:rPr>
+          <w:rFonts w:ascii="Consolas" w:cs="Consolas" w:eastAsia="Consolas" w:hAnsi="Consolas"/>
+          <w:color w:val="1A3A2A"/>
+          <w:sz w:val="18"/>
+          <w:szCs w:val="18"/>
+        </w:rPr>
+        <w:t xml:space="preserve">    categoria_nome       VARCHAR(50) NOT NULL,</w:t>
+      </w:r>
+    </w:p>
+    <w:p>
+      <w:pPr>
+        <w:shd w:fill="F4FAF6" w:val="clear"/>
+        <w:spacing w:after="0" w:before="0"/>
+        <w:ind w:left="200"/>
+      </w:pPr>
+      <w:r>
+        <w:rPr>
+          <w:rFonts w:ascii="Consolas" w:cs="Consolas" w:eastAsia="Consolas" w:hAnsi="Consolas"/>
+          <w:color w:val="1A3A2A"/>
+          <w:sz w:val="18"/>
+          <w:szCs w:val="18"/>
+        </w:rPr>
+        <w:t xml:space="preserve">    quantidade           DECIMAL(10,2) NOT NULL,</w:t>
+      </w:r>
+    </w:p>
+    <w:p>
+      <w:pPr>
+        <w:shd w:fill="F4FAF6" w:val="clear"/>
+        <w:spacing w:after="0" w:before="0"/>
+        <w:ind w:left="200"/>
+      </w:pPr>
+      <w:r>
+        <w:rPr>
+          <w:rFonts w:ascii="Consolas" w:cs="Consolas" w:eastAsia="Consolas" w:hAnsi="Consolas"/>
+          <w:color w:val="1A3A2A"/>
+          <w:sz w:val="18"/>
+          <w:szCs w:val="18"/>
+        </w:rPr>
+        <w:t xml:space="preserve">    unidade              VARCHAR(20) NOT NULL,</w:t>
+      </w:r>
+    </w:p>
+    <w:p>
+      <w:pPr>
+        <w:shd w:fill="F4FAF6" w:val="clear"/>
+        <w:spacing w:after="0" w:before="0"/>
+        <w:ind w:left="200"/>
+      </w:pPr>
+      <w:r>
+        <w:rPr>
+          <w:rFonts w:ascii="Consolas" w:cs="Consolas" w:eastAsia="Consolas" w:hAnsi="Consolas"/>
+          <w:color w:val="1A3A2A"/>
+          <w:sz w:val="18"/>
+          <w:szCs w:val="18"/>
+        </w:rPr>
+        <w:t xml:space="preserve">    data_validade        DATE NOT NULL,</w:t>
+      </w:r>
+    </w:p>
+    <w:p>
+      <w:pPr>
+        <w:shd w:fill="F4FAF6" w:val="clear"/>
+        <w:spacing w:after="0" w:before="0"/>
+        <w:ind w:left="200"/>
+      </w:pPr>
+      <w:r>
+        <w:rPr>
+          <w:rFonts w:ascii="Consolas" w:cs="Consolas" w:eastAsia="Consolas" w:hAnsi="Consolas"/>
+          <w:color w:val="1A3A2A"/>
+          <w:sz w:val="18"/>
+          <w:szCs w:val="18"/>
+        </w:rPr>
+        <w:t xml:space="preserve">    local_armazenamento  VARCHAR(50),</w:t>
+      </w:r>
+    </w:p>
+    <w:p>
+      <w:pPr>
+        <w:shd w:fill="F4FAF6" w:val="clear"/>
+        <w:spacing w:after="0" w:before="0"/>
+        <w:ind w:left="200"/>
+      </w:pPr>
+      <w:r>
+        <w:rPr>
+          <w:rFonts w:ascii="Consolas" w:cs="Consolas" w:eastAsia="Consolas" w:hAnsi="Consolas"/>
+          <w:color w:val="1A3A2A"/>
+          <w:sz w:val="18"/>
+          <w:szCs w:val="18"/>
+        </w:rPr>
+        <w:t xml:space="preserve">    status_saida         VARCHAR(20) NOT NULL,</w:t>
+      </w:r>
+    </w:p>
+    <w:p>
+      <w:pPr>
+        <w:shd w:fill="F4FAF6" w:val="clear"/>
+        <w:spacing w:after="0" w:before="0"/>
+        <w:ind w:left="200"/>
+      </w:pPr>
+      <w:r>
+        <w:rPr>
+          <w:rFonts w:ascii="Consolas" w:cs="Consolas" w:eastAsia="Consolas" w:hAnsi="Consolas"/>
+          <w:color w:val="1A3A2A"/>
+          <w:sz w:val="18"/>
+          <w:szCs w:val="18"/>
+        </w:rPr>
+        <w:t xml:space="preserve">    data_saida           TIMESTAMP DEFAULT CURRENT_TIMESTAMP,</w:t>
+      </w:r>
+    </w:p>
+    <w:p>
+      <w:pPr>
+        <w:shd w:fill="F4FAF6" w:val="clear"/>
+        <w:spacing w:after="0" w:before="0"/>
+        <w:ind w:left="200"/>
+      </w:pPr>
+      <w:r>
+        <w:rPr>
+          <w:rFonts w:ascii="Consolas" w:cs="Consolas" w:eastAsia="Consolas" w:hAnsi="Consolas"/>
+          <w:color w:val="1A3A2A"/>
+          <w:sz w:val="18"/>
+          <w:szCs w:val="18"/>
+        </w:rPr>
+        <w:t xml:space="preserve">    criado_em            TIMESTAMP NOT NULL,</w:t>
+      </w:r>
+    </w:p>
+    <w:p>
+      <w:pPr>
+        <w:shd w:fill="F4FAF6" w:val="clear"/>
+        <w:spacing w:after="0" w:before="0"/>
+        <w:ind w:left="200"/>
+      </w:pPr>
+      <w:r>
+        <w:rPr>
+          <w:rFonts w:ascii="Consolas" w:cs="Consolas" w:eastAsia="Consolas" w:hAnsi="Consolas"/>
+          <w:color w:val="1A3A2A"/>
+          <w:sz w:val="18"/>
+          <w:szCs w:val="18"/>
+        </w:rPr>
+        <w:t xml:space="preserve"> </w:t>
+      </w:r>
+    </w:p>
+    <w:p>
+      <w:pPr>
+        <w:shd w:fill="F4FAF6" w:val="clear"/>
+        <w:spacing w:after="0" w:before="0"/>
+        <w:ind w:left="200"/>
+      </w:pPr>
+      <w:r>
+        <w:rPr>
+          <w:rFonts w:ascii="Consolas" w:cs="Consolas" w:eastAsia="Consolas" w:hAnsi="Consolas"/>
+          <w:color w:val="1A3A2A"/>
+          <w:sz w:val="18"/>
+          <w:szCs w:val="18"/>
+        </w:rPr>
+        <w:t xml:space="preserve">    CONSTRAINT chk_historico_status_saida</w:t>
+      </w:r>
+    </w:p>
+    <w:p>
+      <w:pPr>
+        <w:shd w:fill="F4FAF6" w:val="clear"/>
+        <w:spacing w:after="0" w:before="0"/>
+        <w:ind w:left="200"/>
+      </w:pPr>
+      <w:r>
+        <w:rPr>
+          <w:rFonts w:ascii="Consolas" w:cs="Consolas" w:eastAsia="Consolas" w:hAnsi="Consolas"/>
+          <w:color w:val="1A3A2A"/>
+          <w:sz w:val="18"/>
+          <w:szCs w:val="18"/>
+        </w:rPr>
+        <w:t xml:space="preserve">        CHECK (status_saida IN ('consumido', 'descartado'))</w:t>
+      </w:r>
+    </w:p>
+    <w:p>
+      <w:pPr>
+        <w:shd w:fill="F4FAF6" w:val="clear"/>
+        <w:spacing w:after="0" w:before="0"/>
+        <w:ind w:left="200"/>
+      </w:pPr>
+      <w:r>
+        <w:rPr>
+          <w:rFonts w:ascii="Consolas" w:cs="Consolas" w:eastAsia="Consolas" w:hAnsi="Consolas"/>
+          <w:color w:val="1A3A2A"/>
+          <w:sz w:val="18"/>
+          <w:szCs w:val="18"/>
+        </w:rPr>
+        <w:t xml:space="preserve">);</w:t>
+      </w:r>
+    </w:p>
+    <w:p>
+      <w:pPr>
+        <w:shd w:fill="F4FAF6" w:val="clear"/>
+        <w:spacing w:after="0" w:before="0"/>
+        <w:ind w:left="200"/>
+      </w:pPr>
+      <w:r>
+        <w:rPr>
+          <w:rFonts w:ascii="Consolas" w:cs="Consolas" w:eastAsia="Consolas" w:hAnsi="Consolas"/>
+          <w:color w:val="1A3A2A"/>
+          <w:sz w:val="18"/>
+          <w:szCs w:val="18"/>
+        </w:rPr>
+        <w:t xml:space="preserve"> </w:t>
+      </w:r>
+    </w:p>
+    <w:p>
+      <w:pPr>
+        <w:shd w:fill="F4FAF6" w:val="clear"/>
+        <w:spacing w:after="0" w:before="0"/>
+        <w:ind w:left="200"/>
+      </w:pPr>
+      <w:r>
+        <w:rPr>
+          <w:rFonts w:ascii="Consolas" w:cs="Consolas" w:eastAsia="Consolas" w:hAnsi="Consolas"/>
+          <w:color w:val="1A3A2A"/>
+          <w:sz w:val="18"/>
+          <w:szCs w:val="18"/>
+        </w:rPr>
+        <w:t xml:space="preserve">-- Índices de apoio às agregações do relatório (por status, categoria e período)</w:t>
+      </w:r>
+    </w:p>
+    <w:p>
+      <w:pPr>
+        <w:shd w:fill="F4FAF6" w:val="clear"/>
+        <w:spacing w:after="0" w:before="0"/>
+        <w:ind w:left="200"/>
+      </w:pPr>
+      <w:r>
+        <w:rPr>
+          <w:rFonts w:ascii="Consolas" w:cs="Consolas" w:eastAsia="Consolas" w:hAnsi="Consolas"/>
+          <w:color w:val="1A3A2A"/>
+          <w:sz w:val="18"/>
+          <w:szCs w:val="18"/>
+        </w:rPr>
+        <w:t xml:space="preserve">CREATE INDEX idx_historico_status_saida</w:t>
+      </w:r>
+    </w:p>
+    <w:p>
+      <w:pPr>
+        <w:shd w:fill="F4FAF6" w:val="clear"/>
+        <w:spacing w:after="0" w:before="0"/>
+        <w:ind w:left="200"/>
+      </w:pPr>
+      <w:r>
+        <w:rPr>
+          <w:rFonts w:ascii="Consolas" w:cs="Consolas" w:eastAsia="Consolas" w:hAnsi="Consolas"/>
+          <w:color w:val="1A3A2A"/>
+          <w:sz w:val="18"/>
+          <w:szCs w:val="18"/>
+        </w:rPr>
+        <w:t xml:space="preserve">    ON historico_alimentos (status_saida);</w:t>
+      </w:r>
+    </w:p>
+    <w:p>
+      <w:pPr>
+        <w:shd w:fill="F4FAF6" w:val="clear"/>
+        <w:spacing w:after="0" w:before="0"/>
+        <w:ind w:left="200"/>
+      </w:pPr>
+      <w:r>
+        <w:rPr>
+          <w:rFonts w:ascii="Consolas" w:cs="Consolas" w:eastAsia="Consolas" w:hAnsi="Consolas"/>
+          <w:color w:val="1A3A2A"/>
+          <w:sz w:val="18"/>
+          <w:szCs w:val="18"/>
+        </w:rPr>
+        <w:t xml:space="preserve"> </w:t>
+      </w:r>
+    </w:p>
+    <w:p>
+      <w:pPr>
+        <w:shd w:fill="F4FAF6" w:val="clear"/>
+        <w:spacing w:after="0" w:before="0"/>
+        <w:ind w:left="200"/>
+      </w:pPr>
+      <w:r>
+        <w:rPr>
+          <w:rFonts w:ascii="Consolas" w:cs="Consolas" w:eastAsia="Consolas" w:hAnsi="Consolas"/>
+          <w:color w:val="1A3A2A"/>
+          <w:sz w:val="18"/>
+          <w:szCs w:val="18"/>
+        </w:rPr>
+        <w:t xml:space="preserve">CREATE INDEX idx_historico_categoria_id</w:t>
+      </w:r>
+    </w:p>
+    <w:p>
+      <w:pPr>
+        <w:shd w:fill="F4FAF6" w:val="clear"/>
+        <w:spacing w:after="0" w:before="0"/>
+        <w:ind w:left="200"/>
+      </w:pPr>
+      <w:r>
+        <w:rPr>
+          <w:rFonts w:ascii="Consolas" w:cs="Consolas" w:eastAsia="Consolas" w:hAnsi="Consolas"/>
+          <w:color w:val="1A3A2A"/>
+          <w:sz w:val="18"/>
+          <w:szCs w:val="18"/>
+        </w:rPr>
+        <w:t xml:space="preserve">    ON historico_alimentos (categoria_id);</w:t>
+      </w:r>
+    </w:p>
+    <w:p>
+      <w:pPr>
+        <w:shd w:fill="F4FAF6" w:val="clear"/>
+        <w:spacing w:after="0" w:before="0"/>
+        <w:ind w:left="200"/>
+      </w:pPr>
+      <w:r>
+        <w:rPr>
+          <w:rFonts w:ascii="Consolas" w:cs="Consolas" w:eastAsia="Consolas" w:hAnsi="Consolas"/>
+          <w:color w:val="1A3A2A"/>
+          <w:sz w:val="18"/>
+          <w:szCs w:val="18"/>
+        </w:rPr>
+        <w:t xml:space="preserve"> </w:t>
+      </w:r>
+    </w:p>
+    <w:p>
+      <w:pPr>
+        <w:shd w:fill="F4FAF6" w:val="clear"/>
+        <w:spacing w:after="0" w:before="0"/>
+        <w:ind w:left="200"/>
+      </w:pPr>
+      <w:r>
+        <w:rPr>
+          <w:rFonts w:ascii="Consolas" w:cs="Consolas" w:eastAsia="Consolas" w:hAnsi="Consolas"/>
+          <w:color w:val="1A3A2A"/>
+          <w:sz w:val="18"/>
+          <w:szCs w:val="18"/>
+        </w:rPr>
+        <w:t xml:space="preserve">CREATE INDEX idx_historico_data_saida</w:t>
+      </w:r>
+    </w:p>
+    <w:p>
+      <w:pPr>
+        <w:shd w:fill="F4FAF6" w:val="clear"/>
+        <w:spacing w:after="0" w:before="0"/>
+        <w:ind w:left="200"/>
+      </w:pPr>
+      <w:r>
+        <w:rPr>
+          <w:rFonts w:ascii="Consolas" w:cs="Consolas" w:eastAsia="Consolas" w:hAnsi="Consolas"/>
+          <w:color w:val="1A3A2A"/>
+          <w:sz w:val="18"/>
+          <w:szCs w:val="18"/>
+        </w:rPr>
+        <w:t xml:space="preserve">    ON historico_alimentos (data_saida);</w:t>
+      </w:r>
+    </w:p>
+    <w:p>
+      <w:pPr>
+        <w:shd w:fill="F4FAF6" w:val="clear"/>
+        <w:spacing w:after="0" w:before="0"/>
+        <w:ind w:left="200"/>
+      </w:pPr>
+      <w:r>
+        <w:rPr>
+          <w:rFonts w:ascii="Consolas" w:cs="Consolas" w:eastAsia="Consolas" w:hAnsi="Consolas"/>
+          <w:color w:val="1A3A2A"/>
+          <w:sz w:val="18"/>
+          <w:szCs w:val="18"/>
+        </w:rPr>
+        <w:t xml:space="preserve"> </w:t>
+      </w:r>
+    </w:p>
+    <w:p>
+      <w:pPr>
+        <w:shd w:fill="F4FAF6" w:val="clear"/>
+        <w:spacing w:after="0" w:before="0"/>
+        <w:ind w:left="200"/>
+      </w:pPr>
+      <w:r>
+        <w:rPr>
+          <w:rFonts w:ascii="Consolas" w:cs="Consolas" w:eastAsia="Consolas" w:hAnsi="Consolas"/>
+          <w:color w:val="1A3A2A"/>
+          <w:sz w:val="18"/>
+          <w:szCs w:val="18"/>
+        </w:rPr>
+        <w:t xml:space="preserve">-- LISTA_COMPRAS (US-11) — itens manuais ou aceitos a partir de uma sugestão</w:t>
+      </w:r>
+    </w:p>
+    <w:p>
+      <w:pPr>
+        <w:shd w:fill="F4FAF6" w:val="clear"/>
+        <w:spacing w:after="0" w:before="0"/>
+        <w:ind w:left="200"/>
+      </w:pPr>
+      <w:r>
+        <w:rPr>
+          <w:rFonts w:ascii="Consolas" w:cs="Consolas" w:eastAsia="Consolas" w:hAnsi="Consolas"/>
+          <w:color w:val="1A3A2A"/>
+          <w:sz w:val="18"/>
+          <w:szCs w:val="18"/>
+        </w:rPr>
+        <w:t xml:space="preserve">CREATE TABLE lista_compras (</w:t>
+      </w:r>
+    </w:p>
+    <w:p>
+      <w:pPr>
+        <w:shd w:fill="F4FAF6" w:val="clear"/>
+        <w:spacing w:after="0" w:before="0"/>
+        <w:ind w:left="200"/>
+      </w:pPr>
+      <w:r>
+        <w:rPr>
+          <w:rFonts w:ascii="Consolas" w:cs="Consolas" w:eastAsia="Consolas" w:hAnsi="Consolas"/>
+          <w:color w:val="1A3A2A"/>
+          <w:sz w:val="18"/>
+          <w:szCs w:val="18"/>
+        </w:rPr>
+        <w:t xml:space="preserve">    id             SERIAL PRIMARY KEY,</w:t>
+      </w:r>
+    </w:p>
+    <w:p>
+      <w:pPr>
+        <w:shd w:fill="F4FAF6" w:val="clear"/>
+        <w:spacing w:after="0" w:before="0"/>
+        <w:ind w:left="200"/>
+      </w:pPr>
+      <w:r>
+        <w:rPr>
+          <w:rFonts w:ascii="Consolas" w:cs="Consolas" w:eastAsia="Consolas" w:hAnsi="Consolas"/>
+          <w:color w:val="1A3A2A"/>
+          <w:sz w:val="18"/>
+          <w:szCs w:val="18"/>
+        </w:rPr>
+        <w:t xml:space="preserve">    nome           VARCHAR(100) NOT NULL,</w:t>
+      </w:r>
+    </w:p>
+    <w:p>
+      <w:pPr>
+        <w:shd w:fill="F4FAF6" w:val="clear"/>
+        <w:spacing w:after="0" w:before="0"/>
+        <w:ind w:left="200"/>
+      </w:pPr>
+      <w:r>
+        <w:rPr>
+          <w:rFonts w:ascii="Consolas" w:cs="Consolas" w:eastAsia="Consolas" w:hAnsi="Consolas"/>
+          <w:color w:val="1A3A2A"/>
+          <w:sz w:val="18"/>
+          <w:szCs w:val="18"/>
+        </w:rPr>
+        <w:t xml:space="preserve">    quantidade     DECIMAL(10,2),</w:t>
+      </w:r>
+    </w:p>
+    <w:p>
+      <w:pPr>
+        <w:shd w:fill="F4FAF6" w:val="clear"/>
+        <w:spacing w:after="0" w:before="0"/>
+        <w:ind w:left="200"/>
+      </w:pPr>
+      <w:r>
+        <w:rPr>
+          <w:rFonts w:ascii="Consolas" w:cs="Consolas" w:eastAsia="Consolas" w:hAnsi="Consolas"/>
+          <w:color w:val="1A3A2A"/>
+          <w:sz w:val="18"/>
+          <w:szCs w:val="18"/>
+        </w:rPr>
+        <w:t xml:space="preserve">    unidade        VARCHAR(20),</w:t>
+      </w:r>
+    </w:p>
+    <w:p>
+      <w:pPr>
+        <w:shd w:fill="F4FAF6" w:val="clear"/>
+        <w:spacing w:after="0" w:before="0"/>
+        <w:ind w:left="200"/>
+      </w:pPr>
+      <w:r>
+        <w:rPr>
+          <w:rFonts w:ascii="Consolas" w:cs="Consolas" w:eastAsia="Consolas" w:hAnsi="Consolas"/>
+          <w:color w:val="1A3A2A"/>
+          <w:sz w:val="18"/>
+          <w:szCs w:val="18"/>
+        </w:rPr>
+        <w:t xml:space="preserve">    comprado       BOOLEAN NOT NULL DEFAULT false,</w:t>
+      </w:r>
+    </w:p>
+    <w:p>
+      <w:pPr>
+        <w:shd w:fill="F4FAF6" w:val="clear"/>
+        <w:spacing w:after="0" w:before="0"/>
+        <w:ind w:left="200"/>
+      </w:pPr>
+      <w:r>
+        <w:rPr>
+          <w:rFonts w:ascii="Consolas" w:cs="Consolas" w:eastAsia="Consolas" w:hAnsi="Consolas"/>
+          <w:color w:val="1A3A2A"/>
+          <w:sz w:val="18"/>
+          <w:szCs w:val="18"/>
+        </w:rPr>
+        <w:t xml:space="preserve">    origem         VARCHAR(20) NOT NULL DEFAULT 'manual',</w:t>
+      </w:r>
+    </w:p>
+    <w:p>
+      <w:pPr>
+        <w:shd w:fill="F4FAF6" w:val="clear"/>
+        <w:spacing w:after="0" w:before="0"/>
+        <w:ind w:left="200"/>
+      </w:pPr>
+      <w:r>
+        <w:rPr>
+          <w:rFonts w:ascii="Consolas" w:cs="Consolas" w:eastAsia="Consolas" w:hAnsi="Consolas"/>
+          <w:color w:val="1A3A2A"/>
+          <w:sz w:val="18"/>
+          <w:szCs w:val="18"/>
+        </w:rPr>
+        <w:t xml:space="preserve">    criado_em      TIMESTAMP DEFAULT CURRENT_TIMESTAMP,</w:t>
+      </w:r>
+    </w:p>
+    <w:p>
+      <w:pPr>
+        <w:shd w:fill="F4FAF6" w:val="clear"/>
+        <w:spacing w:after="0" w:before="0"/>
+        <w:ind w:left="200"/>
+      </w:pPr>
+      <w:r>
+        <w:rPr>
+          <w:rFonts w:ascii="Consolas" w:cs="Consolas" w:eastAsia="Consolas" w:hAnsi="Consolas"/>
+          <w:color w:val="1A3A2A"/>
+          <w:sz w:val="18"/>
+          <w:szCs w:val="18"/>
+        </w:rPr>
+        <w:t xml:space="preserve"> </w:t>
+      </w:r>
+    </w:p>
+    <w:p>
+      <w:pPr>
+        <w:shd w:fill="F4FAF6" w:val="clear"/>
+        <w:spacing w:after="0" w:before="0"/>
+        <w:ind w:left="200"/>
+      </w:pPr>
+      <w:r>
+        <w:rPr>
+          <w:rFonts w:ascii="Consolas" w:cs="Consolas" w:eastAsia="Consolas" w:hAnsi="Consolas"/>
+          <w:color w:val="1A3A2A"/>
+          <w:sz w:val="18"/>
+          <w:szCs w:val="18"/>
+        </w:rPr>
+        <w:t xml:space="preserve">    CONSTRAINT chk_lista_compras_nome_vazio</w:t>
+      </w:r>
+    </w:p>
+    <w:p>
+      <w:pPr>
+        <w:shd w:fill="F4FAF6" w:val="clear"/>
+        <w:spacing w:after="0" w:before="0"/>
+        <w:ind w:left="200"/>
+      </w:pPr>
+      <w:r>
+        <w:rPr>
+          <w:rFonts w:ascii="Consolas" w:cs="Consolas" w:eastAsia="Consolas" w:hAnsi="Consolas"/>
+          <w:color w:val="1A3A2A"/>
+          <w:sz w:val="18"/>
+          <w:szCs w:val="18"/>
+        </w:rPr>
+        <w:t xml:space="preserve">        CHECK (LENGTH(TRIM(nome)) &gt; 0),</w:t>
+      </w:r>
+    </w:p>
+    <w:p>
+      <w:pPr>
+        <w:shd w:fill="F4FAF6" w:val="clear"/>
+        <w:spacing w:after="0" w:before="0"/>
+        <w:ind w:left="200"/>
+      </w:pPr>
+      <w:r>
+        <w:rPr>
+          <w:rFonts w:ascii="Consolas" w:cs="Consolas" w:eastAsia="Consolas" w:hAnsi="Consolas"/>
+          <w:color w:val="1A3A2A"/>
+          <w:sz w:val="18"/>
+          <w:szCs w:val="18"/>
+        </w:rPr>
+        <w:t xml:space="preserve"> </w:t>
+      </w:r>
+    </w:p>
+    <w:p>
+      <w:pPr>
+        <w:shd w:fill="F4FAF6" w:val="clear"/>
+        <w:spacing w:after="0" w:before="0"/>
+        <w:ind w:left="200"/>
+      </w:pPr>
+      <w:r>
+        <w:rPr>
+          <w:rFonts w:ascii="Consolas" w:cs="Consolas" w:eastAsia="Consolas" w:hAnsi="Consolas"/>
+          <w:color w:val="1A3A2A"/>
+          <w:sz w:val="18"/>
+          <w:szCs w:val="18"/>
+        </w:rPr>
+        <w:t xml:space="preserve">    CONSTRAINT chk_lista_compras_origem</w:t>
+      </w:r>
+    </w:p>
+    <w:p>
+      <w:pPr>
+        <w:shd w:fill="F4FAF6" w:val="clear"/>
+        <w:spacing w:after="0" w:before="0"/>
+        <w:ind w:left="200"/>
+      </w:pPr>
+      <w:r>
+        <w:rPr>
+          <w:rFonts w:ascii="Consolas" w:cs="Consolas" w:eastAsia="Consolas" w:hAnsi="Consolas"/>
+          <w:color w:val="1A3A2A"/>
+          <w:sz w:val="18"/>
+          <w:szCs w:val="18"/>
+        </w:rPr>
+        <w:t xml:space="preserve">        CHECK (origem IN ('manual', 'sugestao'))</w:t>
+      </w:r>
+    </w:p>
+    <w:p>
+      <w:pPr>
+        <w:shd w:fill="F4FAF6" w:val="clear"/>
+        <w:spacing w:after="0" w:before="0"/>
+        <w:ind w:left="200"/>
+      </w:pPr>
+      <w:r>
+        <w:rPr>
+          <w:rFonts w:ascii="Consolas" w:cs="Consolas" w:eastAsia="Consolas" w:hAnsi="Consolas"/>
+          <w:color w:val="1A3A2A"/>
+          <w:sz w:val="18"/>
+          <w:szCs w:val="18"/>
+        </w:rPr>
+        <w:t xml:space="preserve">);</w:t>
+      </w:r>
+    </w:p>
+    <w:p>
+      <w:pPr>
+        <w:shd w:fill="F4FAF6" w:val="clear"/>
+        <w:spacing w:after="0" w:before="0"/>
+        <w:ind w:left="200"/>
+      </w:pPr>
+      <w:r>
+        <w:rPr>
+          <w:rFonts w:ascii="Consolas" w:cs="Consolas" w:eastAsia="Consolas" w:hAnsi="Consolas"/>
+          <w:color w:val="1A3A2A"/>
+          <w:sz w:val="18"/>
+          <w:szCs w:val="18"/>
+        </w:rPr>
+        <w:t xml:space="preserve"> </w:t>
+      </w:r>
+    </w:p>
+    <w:p>
+      <w:pPr>
+        <w:shd w:fill="F4FAF6" w:val="clear"/>
+        <w:spacing w:after="0" w:before="0"/>
+        <w:ind w:left="200"/>
+      </w:pPr>
+      <w:r>
+        <w:rPr>
+          <w:rFonts w:ascii="Consolas" w:cs="Consolas" w:eastAsia="Consolas" w:hAnsi="Consolas"/>
+          <w:color w:val="1A3A2A"/>
+          <w:sz w:val="18"/>
+          <w:szCs w:val="18"/>
+        </w:rPr>
+        <w:t xml:space="preserve">-- Índice de apoio ao filtro pendente x comprado na listagem</w:t>
+      </w:r>
+    </w:p>
+    <w:p>
+      <w:pPr>
+        <w:shd w:fill="F4FAF6" w:val="clear"/>
+        <w:spacing w:after="0" w:before="0"/>
+        <w:ind w:left="200"/>
+      </w:pPr>
+      <w:r>
+        <w:rPr>
+          <w:rFonts w:ascii="Consolas" w:cs="Consolas" w:eastAsia="Consolas" w:hAnsi="Consolas"/>
+          <w:color w:val="1A3A2A"/>
+          <w:sz w:val="18"/>
+          <w:szCs w:val="18"/>
+        </w:rPr>
+        <w:t xml:space="preserve">CREATE INDEX idx_lista_compras_comprado</w:t>
+      </w:r>
+    </w:p>
+    <w:p>
+      <w:pPr>
+        <w:shd w:fill="F4FAF6" w:val="clear"/>
         <w:spacing w:after="160" w:before="0"/>
         <w:ind w:left="200"/>
       </w:pPr>
@@ -3215,7 +6882,7 @@
           <w:sz w:val="18"/>
           <w:szCs w:val="18"/>
         </w:rPr>
-        <w:t xml:space="preserve">    ON alimentos (data_validade);</w:t>
+        <w:t xml:space="preserve">    ON lista_compras (comprado);</w:t>
       </w:r>
     </w:p>
     <w:p>
@@ -3231,7 +6898,7 @@
           <w:sz w:val="22"/>
           <w:szCs w:val="22"/>
         </w:rPr>
-        <w:t xml:space="preserve">5.1  Trigger de Auditoria</w:t>
+        <w:t xml:space="preserve">6.1  Trigger de Auditoria</w:t>
       </w:r>
     </w:p>
     <w:p>
@@ -3454,7 +7121,7 @@
           <w:sz w:val="22"/>
           <w:szCs w:val="22"/>
         </w:rPr>
-        <w:t xml:space="preserve">5.2  Visão de Status de Vencimento</w:t>
+        <w:t xml:space="preserve">6.2  Visão de Status de Vencimento</w:t>
       </w:r>
     </w:p>
     <w:p>
@@ -3827,6 +7494,165 @@
     <w:p>
       <w:pPr>
         <w:shd w:fill="F4FAF6" w:val="clear"/>
+        <w:spacing w:after="0" w:before="0"/>
+        <w:ind w:left="200"/>
+      </w:pPr>
+      <w:r>
+        <w:rPr>
+          <w:rFonts w:ascii="Consolas" w:cs="Consolas" w:eastAsia="Consolas" w:hAnsi="Consolas"/>
+          <w:color w:val="1A3A2A"/>
+          <w:sz w:val="18"/>
+          <w:szCs w:val="18"/>
+        </w:rPr>
+        <w:t xml:space="preserve">INNER JOIN categorias c ON a.categoria_id = c.id;</w:t>
+      </w:r>
+    </w:p>
+    <w:p>
+      <w:pPr>
+        <w:spacing w:after="100" w:before="240"/>
+      </w:pPr>
+      <w:r>
+        <w:rPr>
+          <w:rFonts w:ascii="Arial" w:cs="Arial" w:eastAsia="Arial" w:hAnsi="Arial"/>
+          <w:b/>
+          <w:bCs/>
+          <w:color w:val="2D6A4F"/>
+          <w:sz w:val="22"/>
+          <w:szCs w:val="22"/>
+        </w:rPr>
+        <w:t xml:space="preserve">6.3  View de Desperdício por Categoria</w:t>
+      </w:r>
+    </w:p>
+    <w:p>
+      <w:pPr>
+        <w:spacing w:after="140" w:line="300"/>
+        <w:jc w:val="both"/>
+      </w:pPr>
+      <w:r>
+        <w:rPr>
+          <w:rFonts w:ascii="Arial" w:cs="Arial" w:eastAsia="Arial" w:hAnsi="Arial"/>
+          <w:color w:val="1A2E22"/>
+          <w:sz w:val="20"/>
+          <w:szCs w:val="20"/>
+        </w:rPr>
+        <w:t xml:space="preserve">Agrega HISTORICO_ALIMENTOS por categoria — total consumido, total descartado e quantidade descartada. É a base do endpoint GET /relatorios/desperdicio (US-12), evitando que a agregação seja recalculada em cada chamada pela aplicação.</w:t>
+      </w:r>
+    </w:p>
+    <w:p>
+      <w:pPr>
+        <w:shd w:fill="F4FAF6" w:val="clear"/>
+        <w:spacing w:after="0" w:before="80"/>
+        <w:ind w:left="200"/>
+      </w:pPr>
+      <w:r>
+        <w:rPr>
+          <w:rFonts w:ascii="Consolas" w:cs="Consolas" w:eastAsia="Consolas" w:hAnsi="Consolas"/>
+          <w:color w:val="1A3A2A"/>
+          <w:sz w:val="18"/>
+          <w:szCs w:val="18"/>
+        </w:rPr>
+        <w:t xml:space="preserve">CREATE VIEW vw_desperdicio_por_categoria AS</w:t>
+      </w:r>
+    </w:p>
+    <w:p>
+      <w:pPr>
+        <w:shd w:fill="F4FAF6" w:val="clear"/>
+        <w:spacing w:after="0" w:before="0"/>
+        <w:ind w:left="200"/>
+      </w:pPr>
+      <w:r>
+        <w:rPr>
+          <w:rFonts w:ascii="Consolas" w:cs="Consolas" w:eastAsia="Consolas" w:hAnsi="Consolas"/>
+          <w:color w:val="1A3A2A"/>
+          <w:sz w:val="18"/>
+          <w:szCs w:val="18"/>
+        </w:rPr>
+        <w:t xml:space="preserve">SELECT</w:t>
+      </w:r>
+    </w:p>
+    <w:p>
+      <w:pPr>
+        <w:shd w:fill="F4FAF6" w:val="clear"/>
+        <w:spacing w:after="0" w:before="0"/>
+        <w:ind w:left="200"/>
+      </w:pPr>
+      <w:r>
+        <w:rPr>
+          <w:rFonts w:ascii="Consolas" w:cs="Consolas" w:eastAsia="Consolas" w:hAnsi="Consolas"/>
+          <w:color w:val="1A3A2A"/>
+          <w:sz w:val="18"/>
+          <w:szCs w:val="18"/>
+        </w:rPr>
+        <w:t xml:space="preserve">    categoria_nome AS categoria,</w:t>
+      </w:r>
+    </w:p>
+    <w:p>
+      <w:pPr>
+        <w:shd w:fill="F4FAF6" w:val="clear"/>
+        <w:spacing w:after="0" w:before="0"/>
+        <w:ind w:left="200"/>
+      </w:pPr>
+      <w:r>
+        <w:rPr>
+          <w:rFonts w:ascii="Consolas" w:cs="Consolas" w:eastAsia="Consolas" w:hAnsi="Consolas"/>
+          <w:color w:val="1A3A2A"/>
+          <w:sz w:val="18"/>
+          <w:szCs w:val="18"/>
+        </w:rPr>
+        <w:t xml:space="preserve">    COUNT(*) FILTER (WHERE status_saida = 'descartado')  AS total_descartado,</w:t>
+      </w:r>
+    </w:p>
+    <w:p>
+      <w:pPr>
+        <w:shd w:fill="F4FAF6" w:val="clear"/>
+        <w:spacing w:after="0" w:before="0"/>
+        <w:ind w:left="200"/>
+      </w:pPr>
+      <w:r>
+        <w:rPr>
+          <w:rFonts w:ascii="Consolas" w:cs="Consolas" w:eastAsia="Consolas" w:hAnsi="Consolas"/>
+          <w:color w:val="1A3A2A"/>
+          <w:sz w:val="18"/>
+          <w:szCs w:val="18"/>
+        </w:rPr>
+        <w:t xml:space="preserve">    COUNT(*) FILTER (WHERE status_saida = 'consumido')   AS total_consumido,</w:t>
+      </w:r>
+    </w:p>
+    <w:p>
+      <w:pPr>
+        <w:shd w:fill="F4FAF6" w:val="clear"/>
+        <w:spacing w:after="0" w:before="0"/>
+        <w:ind w:left="200"/>
+      </w:pPr>
+      <w:r>
+        <w:rPr>
+          <w:rFonts w:ascii="Consolas" w:cs="Consolas" w:eastAsia="Consolas" w:hAnsi="Consolas"/>
+          <w:color w:val="1A3A2A"/>
+          <w:sz w:val="18"/>
+          <w:szCs w:val="18"/>
+        </w:rPr>
+        <w:t xml:space="preserve">    SUM(quantidade) FILTER (WHERE status_saida = 'descartado') AS quantidade_descartada</w:t>
+      </w:r>
+    </w:p>
+    <w:p>
+      <w:pPr>
+        <w:shd w:fill="F4FAF6" w:val="clear"/>
+        <w:spacing w:after="0" w:before="0"/>
+        <w:ind w:left="200"/>
+      </w:pPr>
+      <w:r>
+        <w:rPr>
+          <w:rFonts w:ascii="Consolas" w:cs="Consolas" w:eastAsia="Consolas" w:hAnsi="Consolas"/>
+          <w:color w:val="1A3A2A"/>
+          <w:sz w:val="18"/>
+          <w:szCs w:val="18"/>
+        </w:rPr>
+        <w:t xml:space="preserve">FROM historico_alimentos</w:t>
+      </w:r>
+    </w:p>
+    <w:p>
+      <w:pPr>
+        <w:shd w:fill="F4FAF6" w:val="clear"/>
         <w:spacing w:after="160" w:before="0"/>
         <w:ind w:left="200"/>
       </w:pPr>
@@ -3837,7 +7663,310 @@
           <w:sz w:val="18"/>
           <w:szCs w:val="18"/>
         </w:rPr>
-        <w:t xml:space="preserve">INNER JOIN categorias c ON a.categoria_id = c.id;</w:t>
+        <w:t xml:space="preserve">GROUP BY categoria_nome;</w:t>
+      </w:r>
+    </w:p>
+    <w:p>
+      <w:pPr>
+        <w:spacing w:after="100" w:before="240"/>
+      </w:pPr>
+      <w:r>
+        <w:rPr>
+          <w:rFonts w:ascii="Arial" w:cs="Arial" w:eastAsia="Arial" w:hAnsi="Arial"/>
+          <w:b/>
+          <w:bCs/>
+          <w:color w:val="2D6A4F"/>
+          <w:sz w:val="22"/>
+          <w:szCs w:val="22"/>
+        </w:rPr>
+        <w:t xml:space="preserve">6.4  View de Sugestão de Compras</w:t>
+      </w:r>
+    </w:p>
+    <w:p>
+      <w:pPr>
+        <w:spacing w:after="140" w:line="300"/>
+        <w:jc w:val="both"/>
+      </w:pPr>
+      <w:r>
+        <w:rPr>
+          <w:rFonts w:ascii="Arial" w:cs="Arial" w:eastAsia="Arial" w:hAnsi="Arial"/>
+          <w:color w:val="1A2E22"/>
+          <w:sz w:val="20"/>
+          <w:szCs w:val="20"/>
+        </w:rPr>
+        <w:t xml:space="preserve">Cruza HISTORICO_ALIMENTOS (últimos 60 dias) com ALIMENTOS e LISTA_COMPRAS: sugere itens que saíram da despensa, ainda não voltaram ao estoque e ainda não estão pendentes na lista — sem persistir nada, é só leitura. Base do endpoint GET /lista-compras/sugestoes (US-11).</w:t>
+      </w:r>
+    </w:p>
+    <w:p>
+      <w:pPr>
+        <w:shd w:fill="F4FAF6" w:val="clear"/>
+        <w:spacing w:after="0" w:before="80"/>
+        <w:ind w:left="200"/>
+      </w:pPr>
+      <w:r>
+        <w:rPr>
+          <w:rFonts w:ascii="Consolas" w:cs="Consolas" w:eastAsia="Consolas" w:hAnsi="Consolas"/>
+          <w:color w:val="1A3A2A"/>
+          <w:sz w:val="18"/>
+          <w:szCs w:val="18"/>
+        </w:rPr>
+        <w:t xml:space="preserve">CREATE VIEW vw_sugestao_compras AS</w:t>
+      </w:r>
+    </w:p>
+    <w:p>
+      <w:pPr>
+        <w:shd w:fill="F4FAF6" w:val="clear"/>
+        <w:spacing w:after="0" w:before="0"/>
+        <w:ind w:left="200"/>
+      </w:pPr>
+      <w:r>
+        <w:rPr>
+          <w:rFonts w:ascii="Consolas" w:cs="Consolas" w:eastAsia="Consolas" w:hAnsi="Consolas"/>
+          <w:color w:val="1A3A2A"/>
+          <w:sz w:val="18"/>
+          <w:szCs w:val="18"/>
+        </w:rPr>
+        <w:t xml:space="preserve">SELECT</w:t>
+      </w:r>
+    </w:p>
+    <w:p>
+      <w:pPr>
+        <w:shd w:fill="F4FAF6" w:val="clear"/>
+        <w:spacing w:after="0" w:before="0"/>
+        <w:ind w:left="200"/>
+      </w:pPr>
+      <w:r>
+        <w:rPr>
+          <w:rFonts w:ascii="Consolas" w:cs="Consolas" w:eastAsia="Consolas" w:hAnsi="Consolas"/>
+          <w:color w:val="1A3A2A"/>
+          <w:sz w:val="18"/>
+          <w:szCs w:val="18"/>
+        </w:rPr>
+        <w:t xml:space="preserve">    h.nome,</w:t>
+      </w:r>
+    </w:p>
+    <w:p>
+      <w:pPr>
+        <w:shd w:fill="F4FAF6" w:val="clear"/>
+        <w:spacing w:after="0" w:before="0"/>
+        <w:ind w:left="200"/>
+      </w:pPr>
+      <w:r>
+        <w:rPr>
+          <w:rFonts w:ascii="Consolas" w:cs="Consolas" w:eastAsia="Consolas" w:hAnsi="Consolas"/>
+          <w:color w:val="1A3A2A"/>
+          <w:sz w:val="18"/>
+          <w:szCs w:val="18"/>
+        </w:rPr>
+        <w:t xml:space="preserve">    h.categoria_nome AS categoria,</w:t>
+      </w:r>
+    </w:p>
+    <w:p>
+      <w:pPr>
+        <w:shd w:fill="F4FAF6" w:val="clear"/>
+        <w:spacing w:after="0" w:before="0"/>
+        <w:ind w:left="200"/>
+      </w:pPr>
+      <w:r>
+        <w:rPr>
+          <w:rFonts w:ascii="Consolas" w:cs="Consolas" w:eastAsia="Consolas" w:hAnsi="Consolas"/>
+          <w:color w:val="1A3A2A"/>
+          <w:sz w:val="18"/>
+          <w:szCs w:val="18"/>
+        </w:rPr>
+        <w:t xml:space="preserve">    COUNT(*) AS total_saidas,</w:t>
+      </w:r>
+    </w:p>
+    <w:p>
+      <w:pPr>
+        <w:shd w:fill="F4FAF6" w:val="clear"/>
+        <w:spacing w:after="0" w:before="0"/>
+        <w:ind w:left="200"/>
+      </w:pPr>
+      <w:r>
+        <w:rPr>
+          <w:rFonts w:ascii="Consolas" w:cs="Consolas" w:eastAsia="Consolas" w:hAnsi="Consolas"/>
+          <w:color w:val="1A3A2A"/>
+          <w:sz w:val="18"/>
+          <w:szCs w:val="18"/>
+        </w:rPr>
+        <w:t xml:space="preserve">    MAX(h.data_saida) AS ultima_saida</w:t>
+      </w:r>
+    </w:p>
+    <w:p>
+      <w:pPr>
+        <w:shd w:fill="F4FAF6" w:val="clear"/>
+        <w:spacing w:after="0" w:before="0"/>
+        <w:ind w:left="200"/>
+      </w:pPr>
+      <w:r>
+        <w:rPr>
+          <w:rFonts w:ascii="Consolas" w:cs="Consolas" w:eastAsia="Consolas" w:hAnsi="Consolas"/>
+          <w:color w:val="1A3A2A"/>
+          <w:sz w:val="18"/>
+          <w:szCs w:val="18"/>
+        </w:rPr>
+        <w:t xml:space="preserve">FROM historico_alimentos h</w:t>
+      </w:r>
+    </w:p>
+    <w:p>
+      <w:pPr>
+        <w:shd w:fill="F4FAF6" w:val="clear"/>
+        <w:spacing w:after="0" w:before="0"/>
+        <w:ind w:left="200"/>
+      </w:pPr>
+      <w:r>
+        <w:rPr>
+          <w:rFonts w:ascii="Consolas" w:cs="Consolas" w:eastAsia="Consolas" w:hAnsi="Consolas"/>
+          <w:color w:val="1A3A2A"/>
+          <w:sz w:val="18"/>
+          <w:szCs w:val="18"/>
+        </w:rPr>
+        <w:t xml:space="preserve">WHERE h.data_saida &gt;= (CURRENT_DATE - INTERVAL '60 days')</w:t>
+      </w:r>
+    </w:p>
+    <w:p>
+      <w:pPr>
+        <w:shd w:fill="F4FAF6" w:val="clear"/>
+        <w:spacing w:after="0" w:before="0"/>
+        <w:ind w:left="200"/>
+      </w:pPr>
+      <w:r>
+        <w:rPr>
+          <w:rFonts w:ascii="Consolas" w:cs="Consolas" w:eastAsia="Consolas" w:hAnsi="Consolas"/>
+          <w:color w:val="1A3A2A"/>
+          <w:sz w:val="18"/>
+          <w:szCs w:val="18"/>
+        </w:rPr>
+        <w:t xml:space="preserve">  AND NOT EXISTS (</w:t>
+      </w:r>
+    </w:p>
+    <w:p>
+      <w:pPr>
+        <w:shd w:fill="F4FAF6" w:val="clear"/>
+        <w:spacing w:after="0" w:before="0"/>
+        <w:ind w:left="200"/>
+      </w:pPr>
+      <w:r>
+        <w:rPr>
+          <w:rFonts w:ascii="Consolas" w:cs="Consolas" w:eastAsia="Consolas" w:hAnsi="Consolas"/>
+          <w:color w:val="1A3A2A"/>
+          <w:sz w:val="18"/>
+          <w:szCs w:val="18"/>
+        </w:rPr>
+        <w:t xml:space="preserve">    SELECT 1 FROM alimentos a WHERE LOWER(a.nome) = LOWER(h.nome)</w:t>
+      </w:r>
+    </w:p>
+    <w:p>
+      <w:pPr>
+        <w:shd w:fill="F4FAF6" w:val="clear"/>
+        <w:spacing w:after="0" w:before="0"/>
+        <w:ind w:left="200"/>
+      </w:pPr>
+      <w:r>
+        <w:rPr>
+          <w:rFonts w:ascii="Consolas" w:cs="Consolas" w:eastAsia="Consolas" w:hAnsi="Consolas"/>
+          <w:color w:val="1A3A2A"/>
+          <w:sz w:val="18"/>
+          <w:szCs w:val="18"/>
+        </w:rPr>
+        <w:t xml:space="preserve">  )</w:t>
+      </w:r>
+    </w:p>
+    <w:p>
+      <w:pPr>
+        <w:shd w:fill="F4FAF6" w:val="clear"/>
+        <w:spacing w:after="0" w:before="0"/>
+        <w:ind w:left="200"/>
+      </w:pPr>
+      <w:r>
+        <w:rPr>
+          <w:rFonts w:ascii="Consolas" w:cs="Consolas" w:eastAsia="Consolas" w:hAnsi="Consolas"/>
+          <w:color w:val="1A3A2A"/>
+          <w:sz w:val="18"/>
+          <w:szCs w:val="18"/>
+        </w:rPr>
+        <w:t xml:space="preserve">  AND NOT EXISTS (</w:t>
+      </w:r>
+    </w:p>
+    <w:p>
+      <w:pPr>
+        <w:shd w:fill="F4FAF6" w:val="clear"/>
+        <w:spacing w:after="0" w:before="0"/>
+        <w:ind w:left="200"/>
+      </w:pPr>
+      <w:r>
+        <w:rPr>
+          <w:rFonts w:ascii="Consolas" w:cs="Consolas" w:eastAsia="Consolas" w:hAnsi="Consolas"/>
+          <w:color w:val="1A3A2A"/>
+          <w:sz w:val="18"/>
+          <w:szCs w:val="18"/>
+        </w:rPr>
+        <w:t xml:space="preserve">    SELECT 1 FROM lista_compras lc</w:t>
+      </w:r>
+    </w:p>
+    <w:p>
+      <w:pPr>
+        <w:shd w:fill="F4FAF6" w:val="clear"/>
+        <w:spacing w:after="0" w:before="0"/>
+        <w:ind w:left="200"/>
+      </w:pPr>
+      <w:r>
+        <w:rPr>
+          <w:rFonts w:ascii="Consolas" w:cs="Consolas" w:eastAsia="Consolas" w:hAnsi="Consolas"/>
+          <w:color w:val="1A3A2A"/>
+          <w:sz w:val="18"/>
+          <w:szCs w:val="18"/>
+        </w:rPr>
+        <w:t xml:space="preserve">    WHERE LOWER(lc.nome) = LOWER(h.nome) AND lc.comprado = false</w:t>
+      </w:r>
+    </w:p>
+    <w:p>
+      <w:pPr>
+        <w:shd w:fill="F4FAF6" w:val="clear"/>
+        <w:spacing w:after="0" w:before="0"/>
+        <w:ind w:left="200"/>
+      </w:pPr>
+      <w:r>
+        <w:rPr>
+          <w:rFonts w:ascii="Consolas" w:cs="Consolas" w:eastAsia="Consolas" w:hAnsi="Consolas"/>
+          <w:color w:val="1A3A2A"/>
+          <w:sz w:val="18"/>
+          <w:szCs w:val="18"/>
+        </w:rPr>
+        <w:t xml:space="preserve">  )</w:t>
+      </w:r>
+    </w:p>
+    <w:p>
+      <w:pPr>
+        <w:shd w:fill="F4FAF6" w:val="clear"/>
+        <w:spacing w:after="0" w:before="0"/>
+        <w:ind w:left="200"/>
+      </w:pPr>
+      <w:r>
+        <w:rPr>
+          <w:rFonts w:ascii="Consolas" w:cs="Consolas" w:eastAsia="Consolas" w:hAnsi="Consolas"/>
+          <w:color w:val="1A3A2A"/>
+          <w:sz w:val="18"/>
+          <w:szCs w:val="18"/>
+        </w:rPr>
+        <w:t xml:space="preserve">GROUP BY h.nome, h.categoria_nome</w:t>
+      </w:r>
+    </w:p>
+    <w:p>
+      <w:pPr>
+        <w:shd w:fill="F4FAF6" w:val="clear"/>
+        <w:spacing w:after="160" w:before="0"/>
+        <w:ind w:left="200"/>
+      </w:pPr>
+      <w:r>
+        <w:rPr>
+          <w:rFonts w:ascii="Consolas" w:cs="Consolas" w:eastAsia="Consolas" w:hAnsi="Consolas"/>
+          <w:color w:val="1A3A2A"/>
+          <w:sz w:val="18"/>
+          <w:szCs w:val="18"/>
+        </w:rPr>
+        <w:t xml:space="preserve">ORDER BY total_saidas DESC, ultima_saida DESC;</w:t>
       </w:r>
     </w:p>
     <w:p>
@@ -3857,7 +7986,7 @@
           <w:sz w:val="26"/>
           <w:szCs w:val="26"/>
         </w:rPr>
-        <w:t xml:space="preserve">6.  Exemplos de Consultas (DML)</w:t>
+        <w:t xml:space="preserve">7.  Exemplos de Consultas (DML)</w:t>
       </w:r>
     </w:p>
     <w:p>
@@ -4241,6 +8370,101 @@
     <w:p>
       <w:pPr>
         <w:shd w:fill="F4FAF6" w:val="clear"/>
+        <w:spacing w:after="0" w:before="0"/>
+        <w:ind w:left="200"/>
+      </w:pPr>
+      <w:r>
+        <w:rPr>
+          <w:rFonts w:ascii="Consolas" w:cs="Consolas" w:eastAsia="Consolas" w:hAnsi="Consolas"/>
+          <w:color w:val="1A3A2A"/>
+          <w:sz w:val="18"/>
+          <w:szCs w:val="18"/>
+        </w:rPr>
+        <w:t xml:space="preserve">GROUP BY status;</w:t>
+      </w:r>
+    </w:p>
+    <w:p>
+      <w:pPr>
+        <w:spacing w:after="80" w:line="300"/>
+        <w:jc w:val="both"/>
+      </w:pPr>
+      <w:r>
+        <w:rPr>
+          <w:rFonts w:ascii="Arial" w:cs="Arial" w:eastAsia="Arial" w:hAnsi="Arial"/>
+          <w:color w:val="4A6358"/>
+          <w:sz w:val="19"/>
+          <w:szCs w:val="19"/>
+        </w:rPr>
+        <w:t xml:space="preserve">Itens descartados nos últimos 30 dias (uso do histórico):</w:t>
+      </w:r>
+    </w:p>
+    <w:p>
+      <w:pPr>
+        <w:shd w:fill="F4FAF6" w:val="clear"/>
+        <w:spacing w:after="0" w:before="80"/>
+        <w:ind w:left="200"/>
+      </w:pPr>
+      <w:r>
+        <w:rPr>
+          <w:rFonts w:ascii="Consolas" w:cs="Consolas" w:eastAsia="Consolas" w:hAnsi="Consolas"/>
+          <w:color w:val="1A3A2A"/>
+          <w:sz w:val="18"/>
+          <w:szCs w:val="18"/>
+        </w:rPr>
+        <w:t xml:space="preserve">SELECT nome, categoria_nome, data_saida</w:t>
+      </w:r>
+    </w:p>
+    <w:p>
+      <w:pPr>
+        <w:shd w:fill="F4FAF6" w:val="clear"/>
+        <w:spacing w:after="0" w:before="0"/>
+        <w:ind w:left="200"/>
+      </w:pPr>
+      <w:r>
+        <w:rPr>
+          <w:rFonts w:ascii="Consolas" w:cs="Consolas" w:eastAsia="Consolas" w:hAnsi="Consolas"/>
+          <w:color w:val="1A3A2A"/>
+          <w:sz w:val="18"/>
+          <w:szCs w:val="18"/>
+        </w:rPr>
+        <w:t xml:space="preserve">FROM historico_alimentos</w:t>
+      </w:r>
+    </w:p>
+    <w:p>
+      <w:pPr>
+        <w:shd w:fill="F4FAF6" w:val="clear"/>
+        <w:spacing w:after="0" w:before="0"/>
+        <w:ind w:left="200"/>
+      </w:pPr>
+      <w:r>
+        <w:rPr>
+          <w:rFonts w:ascii="Consolas" w:cs="Consolas" w:eastAsia="Consolas" w:hAnsi="Consolas"/>
+          <w:color w:val="1A3A2A"/>
+          <w:sz w:val="18"/>
+          <w:szCs w:val="18"/>
+        </w:rPr>
+        <w:t xml:space="preserve">WHERE status_saida = 'descartado'</w:t>
+      </w:r>
+    </w:p>
+    <w:p>
+      <w:pPr>
+        <w:shd w:fill="F4FAF6" w:val="clear"/>
+        <w:spacing w:after="0" w:before="0"/>
+        <w:ind w:left="200"/>
+      </w:pPr>
+      <w:r>
+        <w:rPr>
+          <w:rFonts w:ascii="Consolas" w:cs="Consolas" w:eastAsia="Consolas" w:hAnsi="Consolas"/>
+          <w:color w:val="1A3A2A"/>
+          <w:sz w:val="18"/>
+          <w:szCs w:val="18"/>
+        </w:rPr>
+        <w:t xml:space="preserve">  AND data_saida &gt;= CURRENT_DATE - INTERVAL '30 days'</w:t>
+      </w:r>
+    </w:p>
+    <w:p>
+      <w:pPr>
+        <w:shd w:fill="F4FAF6" w:val="clear"/>
         <w:spacing w:after="160" w:before="0"/>
         <w:ind w:left="200"/>
       </w:pPr>
@@ -4251,7 +8475,86 @@
           <w:sz w:val="18"/>
           <w:szCs w:val="18"/>
         </w:rPr>
-        <w:t xml:space="preserve">GROUP BY status;</w:t>
+        <w:t xml:space="preserve">ORDER BY data_saida DESC;</w:t>
+      </w:r>
+    </w:p>
+    <w:p>
+      <w:pPr>
+        <w:spacing w:after="80" w:line="300"/>
+        <w:jc w:val="both"/>
+      </w:pPr>
+      <w:r>
+        <w:rPr>
+          <w:rFonts w:ascii="Arial" w:cs="Arial" w:eastAsia="Arial" w:hAnsi="Arial"/>
+          <w:color w:val="4A6358"/>
+          <w:sz w:val="19"/>
+          <w:szCs w:val="19"/>
+        </w:rPr>
+        <w:t xml:space="preserve">Itens pendentes na lista de compras (ainda não comprados):</w:t>
+      </w:r>
+    </w:p>
+    <w:p>
+      <w:pPr>
+        <w:shd w:fill="F4FAF6" w:val="clear"/>
+        <w:spacing w:after="0" w:before="80"/>
+        <w:ind w:left="200"/>
+      </w:pPr>
+      <w:r>
+        <w:rPr>
+          <w:rFonts w:ascii="Consolas" w:cs="Consolas" w:eastAsia="Consolas" w:hAnsi="Consolas"/>
+          <w:color w:val="1A3A2A"/>
+          <w:sz w:val="18"/>
+          <w:szCs w:val="18"/>
+        </w:rPr>
+        <w:t xml:space="preserve">SELECT nome, quantidade, unidade, origem</w:t>
+      </w:r>
+    </w:p>
+    <w:p>
+      <w:pPr>
+        <w:shd w:fill="F4FAF6" w:val="clear"/>
+        <w:spacing w:after="0" w:before="0"/>
+        <w:ind w:left="200"/>
+      </w:pPr>
+      <w:r>
+        <w:rPr>
+          <w:rFonts w:ascii="Consolas" w:cs="Consolas" w:eastAsia="Consolas" w:hAnsi="Consolas"/>
+          <w:color w:val="1A3A2A"/>
+          <w:sz w:val="18"/>
+          <w:szCs w:val="18"/>
+        </w:rPr>
+        <w:t xml:space="preserve">FROM lista_compras</w:t>
+      </w:r>
+    </w:p>
+    <w:p>
+      <w:pPr>
+        <w:shd w:fill="F4FAF6" w:val="clear"/>
+        <w:spacing w:after="0" w:before="0"/>
+        <w:ind w:left="200"/>
+      </w:pPr>
+      <w:r>
+        <w:rPr>
+          <w:rFonts w:ascii="Consolas" w:cs="Consolas" w:eastAsia="Consolas" w:hAnsi="Consolas"/>
+          <w:color w:val="1A3A2A"/>
+          <w:sz w:val="18"/>
+          <w:szCs w:val="18"/>
+        </w:rPr>
+        <w:t xml:space="preserve">WHERE comprado = false</w:t>
+      </w:r>
+    </w:p>
+    <w:p>
+      <w:pPr>
+        <w:shd w:fill="F4FAF6" w:val="clear"/>
+        <w:spacing w:after="160" w:before="0"/>
+        <w:ind w:left="200"/>
+      </w:pPr>
+      <w:r>
+        <w:rPr>
+          <w:rFonts w:ascii="Consolas" w:cs="Consolas" w:eastAsia="Consolas" w:hAnsi="Consolas"/>
+          <w:color w:val="1A3A2A"/>
+          <w:sz w:val="18"/>
+          <w:szCs w:val="18"/>
+        </w:rPr>
+        <w:t xml:space="preserve">ORDER BY criado_em DESC;</w:t>
       </w:r>
     </w:p>
     <w:p>
@@ -4271,7 +8574,7 @@
           <w:sz w:val="26"/>
           <w:szCs w:val="26"/>
         </w:rPr>
-        <w:t xml:space="preserve">7.  Considerações sobre Integridade e Segurança</w:t>
+        <w:t xml:space="preserve">8.  Considerações sobre Integridade e Segurança</w:t>
       </w:r>
     </w:p>
     <w:p>
@@ -4494,7 +8797,59 @@
           <w:sz w:val="20"/>
           <w:szCs w:val="20"/>
         </w:rPr>
-        <w:t xml:space="preserve">Desempenho: índices nas colunas categoria_id e data_validade otimizam as operações de junção e a ordenação por vencimento, atendendo ao requisito não funcional de tempo de resposta.</w:t>
+        <w:t xml:space="preserve">Desempenho: índices nas colunas categoria_id e data_validade (alimentos), status_saida, categoria_id e data_saida (historico_alimentos) e comprado (lista_compras) otimizam junções, filtros e ordenações, atendendo ao requisito não funcional de tempo de resposta.</w:t>
+      </w:r>
+    </w:p>
+    <w:p>
+      <w:pPr>
+        <w:spacing w:after="80" w:line="300"/>
+        <w:ind w:left="400" w:hanging="200"/>
+      </w:pPr>
+      <w:r>
+        <w:rPr>
+          <w:rFonts w:ascii="Arial" w:cs="Arial" w:eastAsia="Arial" w:hAnsi="Arial"/>
+          <w:b/>
+          <w:bCs/>
+          <w:color w:val="2D6A4F"/>
+          <w:sz w:val="20"/>
+          <w:szCs w:val="20"/>
+        </w:rPr>
+        <w:t xml:space="preserve">•   </w:t>
+      </w:r>
+      <w:r>
+        <w:rPr>
+          <w:rFonts w:ascii="Arial" w:cs="Arial" w:eastAsia="Arial" w:hAnsi="Arial"/>
+          <w:color w:val="1A2E22"/>
+          <w:sz w:val="20"/>
+          <w:szCs w:val="20"/>
+        </w:rPr>
+        <w:t xml:space="preserve">Log append-only: HISTORICO_ALIMENTOS nunca sofre UPDATE nem DELETE por parte da aplicação — só recebe INSERT, o que preserva o histórico de desperdício mesmo que os dados de estoque mudem depois.</w:t>
+      </w:r>
+    </w:p>
+    <w:p>
+      <w:pPr>
+        <w:spacing w:after="80" w:line="300"/>
+        <w:ind w:left="400" w:hanging="200"/>
+      </w:pPr>
+      <w:r>
+        <w:rPr>
+          <w:rFonts w:ascii="Arial" w:cs="Arial" w:eastAsia="Arial" w:hAnsi="Arial"/>
+          <w:b/>
+          <w:bCs/>
+          <w:color w:val="2D6A4F"/>
+          <w:sz w:val="20"/>
+          <w:szCs w:val="20"/>
+        </w:rPr>
+        <w:t xml:space="preserve">•   </w:t>
+      </w:r>
+      <w:r>
+        <w:rPr>
+          <w:rFonts w:ascii="Arial" w:cs="Arial" w:eastAsia="Arial" w:hAnsi="Arial"/>
+          <w:color w:val="1A2E22"/>
+          <w:sz w:val="20"/>
+          <w:szCs w:val="20"/>
+        </w:rPr>
+        <w:t xml:space="preserve">Desacoplamento controlado: LISTA_COMPRAS não tem chave estrangeira com ALIMENTOS nem CATEGORIAS — a ligação com o histórico de consumo é feita em tempo de leitura pela view vw_sugestao_compras (seção 6.4), sem exigir integridade referencial onde ela não faz sentido de negócio.</w:t>
       </w:r>
     </w:p>
     <w:p>

</xml_diff>